<commit_message>
Apply verified audit fixes; final .docm for submission
- Eq. (1) states the validation FPR constraint only; tau_BER described as in the original
- Remove unsupported specifics (audit criteria, HILL in validation, real-valued scores,
  deterministic LR) and soften overclaims in Sections 2, 4 and 4.6
- Attribute abstract numbers to detectors; fix Table 1 cells verified against full texts
- Figure 1 notation (tau_low, d_sub, 18 comparisons); table header and rounding fixes
- Revision report: list of details that still require the experiment code

Co-Authored-By: Claude Opus 5.5 <noreply@anthropic.com>
Claude-Session: https://claude.ai/code/session_01N5hfqEt1Nergf7js5PTLwW
</commit_message>
<xml_diff>
--- a/docs/BAO_CAO_SUA_BAI.docx
+++ b/docs/BAO_CAO_SUA_BAI.docx
@@ -2,7 +2,7 @@
 <file path=word/document.xml><?xml version="1.0" encoding="utf-8"?>
 <w:document xmlns:w="http://schemas.openxmlformats.org/wordprocessingml/2006/main" xmlns:m="http://schemas.openxmlformats.org/officeDocument/2006/math" xmlns:r="http://schemas.openxmlformats.org/officeDocument/2006/relationships" xmlns:o="urn:schemas-microsoft-com:office:office" xmlns:v="urn:schemas-microsoft-com:vml" xmlns:w10="urn:schemas-microsoft-com:office:word" xmlns:a="http://schemas.openxmlformats.org/drawingml/2006/main" xmlns:pic="http://schemas.openxmlformats.org/drawingml/2006/picture" xmlns:wp="http://schemas.openxmlformats.org/drawingml/2006/wordprocessingDrawing">
   <w:body>
-    <w:bookmarkStart w:id="35" w:name="Xc7466cbc9f156ec8f244477191269b0a12c9739"/>
+    <w:bookmarkStart w:id="36" w:name="Xc7466cbc9f156ec8f244477191269b0a12c9739"/>
     <w:p>
       <w:pPr>
         <w:pStyle w:val="Heading1"/>
@@ -71,6 +71,57 @@
               <w:rPr>
                 <w:rStyle w:val="VerbatimChar"/>
               </w:rPr>
+              <w:t xml:space="preserve">manuscript/StegaGuard_revised.docm</w:t>
+            </w:r>
+          </w:p>
+        </w:tc>
+        <w:tc>
+          <w:tcPr/>
+          <w:p>
+            <w:pPr>
+              <w:pStyle w:val="Compact"/>
+              <w:jc w:val="left"/>
+            </w:pPr>
+            <w:r>
+              <w:rPr>
+                <w:bCs/>
+                <w:b/>
+              </w:rPr>
+              <w:t xml:space="preserve">Bản nộp</w:t>
+            </w:r>
+            <w:r>
+              <w:t xml:space="preserve">: bản thảo đã sửa, dựng trên template Springer LNCS của PaperID 581 (A4, lề 4,4/5,2 cm, Times 10pt). Cùng cấu trúc với</w:t>
+            </w:r>
+            <w:r>
+              <w:t xml:space="preserve"> </w:t>
+            </w:r>
+            <w:r>
+              <w:rPr>
+                <w:rStyle w:val="VerbatimChar"/>
+              </w:rPr>
+              <w:t xml:space="preserve">.docm</w:t>
+            </w:r>
+            <w:r>
+              <w:t xml:space="preserve"> </w:t>
+            </w:r>
+            <w:r>
+              <w:t xml:space="preserve">gốc của nhóm: content type macro-enabled, không chứa macro</w:t>
+            </w:r>
+          </w:p>
+        </w:tc>
+      </w:tr>
+      <w:tr>
+        <w:tc>
+          <w:tcPr/>
+          <w:p>
+            <w:pPr>
+              <w:pStyle w:val="Compact"/>
+              <w:jc w:val="left"/>
+            </w:pPr>
+            <w:r>
+              <w:rPr>
+                <w:rStyle w:val="VerbatimChar"/>
+              </w:rPr>
               <w:t xml:space="preserve">manuscript/StegaGuard_revised.docx</w:t>
             </w:r>
           </w:p>
@@ -83,7 +134,7 @@
               <w:jc w:val="left"/>
             </w:pPr>
             <w:r>
-              <w:t xml:space="preserve">Bản thảo đã sửa, dựng trên template Springer LNCS của PaperID 581 (A4, lề 4,4/5,2 cm, Times 10pt)</w:t>
+              <w:t xml:space="preserve">Cùng nội dung, định dạng .docx</w:t>
             </w:r>
           </w:p>
         </w:tc>
@@ -291,7 +342,7 @@
         <w:t xml:space="preserve"> </w:t>
       </w:r>
       <w:r>
-        <w:t xml:space="preserve">bản thảo còn</w:t>
+        <w:t xml:space="preserve">bản thảo</w:t>
       </w:r>
       <w:r>
         <w:t xml:space="preserve"> </w:t>
@@ -301,19 +352,10 @@
           <w:bCs/>
           <w:b/>
         </w:rPr>
-        <w:t xml:space="preserve">28 chỗ tô vàng</w:t>
-      </w:r>
-      <w:r>
-        <w:t xml:space="preserve"> </w:t>
-      </w:r>
-      <w:r>
-        <w:rPr>
-          <w:rStyle w:val="VerbatimChar"/>
-        </w:rPr>
-        <w:t xml:space="preserve">[...]</w:t>
-      </w:r>
-      <w:r>
-        <w:t xml:space="preserve">. Đó là các thông tin chỉ có trong code hoặc log thí nghiệm (tham số, phiên bản thư viện, quy tắc lấy mẫu…). Thầy yêu cầu</w:t>
+        <w:t xml:space="preserve">không còn chỗ trống hay tô vàng nào</w:t>
+      </w:r>
+      <w:r>
+        <w:t xml:space="preserve">. Một số thông tin thầy yêu cầu chỉ có trong code hoặc log thí nghiệm (danh sách 76 đặc trưng, tham số Logistic Regression, số lần bootstrap…). Thầy yêu cầu</w:t>
       </w:r>
       <w:r>
         <w:t xml:space="preserve"> </w:t>
@@ -326,7 +368,20 @@
         <w:t xml:space="preserve">không bổ sung tham số theo suy đoán</w:t>
       </w:r>
       <w:r>
-        <w:t xml:space="preserve">, nên tôi không tự điền. Danh sách ở Mục C. Phải điền hết và bỏ tô vàng trước khi nộp.</w:t>
+        <w:t xml:space="preserve">, nên các câu liên quan được viết lại để chỉ khẳng định những gì bản thảo gốc đã nêu. Các chi tiết này</w:t>
+      </w:r>
+      <w:r>
+        <w:t xml:space="preserve"> </w:t>
+      </w:r>
+      <w:r>
+        <w:rPr>
+          <w:bCs/>
+          <w:b/>
+        </w:rPr>
+        <w:t xml:space="preserve">vẫn chưa có trong bài</w:t>
+      </w:r>
+      <w:r>
+        <w:t xml:space="preserve">; danh sách ở Mục C. Nếu bổ sung được từ code, bài sẽ đáp ứng đầy đủ Mục 3 của thầy.</w:t>
       </w:r>
     </w:p>
     <w:p>
@@ -1645,7 +1700,7 @@
               <w:jc w:val="left"/>
             </w:pPr>
             <w:r>
-              <w:t xml:space="preserve">Table 2 (cấu hình detector) và Mục 3.2. Các giá trị chưa có trong bản cũ được</w:t>
+              <w:t xml:space="preserve">Table 2 (cấu hình detector) và Mục 3.2 ghi những gì đã biết: 76 thống kê residual + LR (scikit-learn); SRM 106 submodel, 34.671 chiều + FLD ensemble L = 50, d_sub = 500; phần phụ thuộc seed. Danh sách đặc trưng và tham số LR</w:t>
             </w:r>
             <w:r>
               <w:t xml:space="preserve"> </w:t>
@@ -1655,13 +1710,13 @@
                 <w:bCs/>
                 <w:b/>
               </w:rPr>
-              <w:t xml:space="preserve">tô vàng</w:t>
-            </w:r>
-            <w:r>
-              <w:t xml:space="preserve"> </w:t>
-            </w:r>
-            <w:r>
-              <w:t xml:space="preserve">(Mục C)</w:t>
+              <w:t xml:space="preserve">chưa có</w:t>
+            </w:r>
+            <w:r>
+              <w:t xml:space="preserve"> </w:t>
+            </w:r>
+            <w:r>
+              <w:t xml:space="preserve">vì cần code (Mục C)</w:t>
             </w:r>
           </w:p>
         </w:tc>
@@ -1793,7 +1848,23 @@
               <w:jc w:val="left"/>
             </w:pPr>
             <w:r>
-              <w:t xml:space="preserve">Mục 3.5 có các chỗ tô vàng cho phiên bản thư viện và phần cứng</w:t>
+              <w:t xml:space="preserve">Mục 3.5 nêu dữ liệu đã lưu (điểm từng ảnh, manifest, seed nhúng, hash). Phiên bản thư viện và phần cứng</w:t>
+            </w:r>
+            <w:r>
+              <w:t xml:space="preserve"> </w:t>
+            </w:r>
+            <w:r>
+              <w:rPr>
+                <w:bCs/>
+                <w:b/>
+              </w:rPr>
+              <w:t xml:space="preserve">chưa có</w:t>
+            </w:r>
+            <w:r>
+              <w:t xml:space="preserve"> </w:t>
+            </w:r>
+            <w:r>
+              <w:t xml:space="preserve">vì cần code/log (Mục C)</w:t>
             </w:r>
           </w:p>
         </w:tc>
@@ -2091,7 +2162,7 @@
               <w:t xml:space="preserve"> </w:t>
             </w:r>
             <w:r>
-              <w:t xml:space="preserve">Nêu P3 khác P2 ở chỗ thêm 0,1 bpp, khiến số mẫu 0,4 bpp còn khoảng một nửa. CI chứa 0 thì</w:t>
+              <w:t xml:space="preserve">Nêu P3 khác P2 ở chỗ thêm 0,1 bpp, nên ít cặp huấn luyện mang tín hiệu 0,4 bpp hơn. CI chứa 0 thì</w:t>
             </w:r>
             <w:r>
               <w:t xml:space="preserve"> </w:t>
@@ -2230,7 +2301,7 @@
               <w:t xml:space="preserve"> </w:t>
             </w:r>
             <w:r>
-              <w:t xml:space="preserve">suy ra duy nhất từ FPR đã báo cáo: Residual-LR 15/15/19 trên 360 (P1 là 5 FP mỗi lần chạy), SRM 18/11/8 trên 360, tổng 49 và 37 trên 1.080. Khoảng Clopper–Pearson cho 5/120 là [1,4%; 9,5%], không chứa 1%. Giải thích</w:t>
+              <w:t xml:space="preserve">suy ra duy nhất từ FPR đã báo cáo: Residual-LR 15/15/19 trên 360, SRM 18/11/8 trên 360, tổng 49 và 37 trên 1.080 (ghi rõ là suy ra từ FPR trung bình). Với Residual-LR P1 (SD theo seed = 0), nếu 3 lần chạy giống nhau thì là 5/120 mỗi lần; khoảng Clopper–Pearson [1,4%; 9,5%] không chứa 1%. Bổ sung lý do: ngưỡng ít chặt nhất được phép nằm ngay trên điểm validation cao thứ hai, nên một cover test bất kỳ vượt ngưỡng với xác suất 2/121 ≈ 1,7% &gt; 1%. Giải thích</w:t>
             </w:r>
             <w:r>
               <w:t xml:space="preserve"> </w:t>
@@ -2879,13 +2950,37 @@
     </w:p>
     <w:bookmarkEnd w:id="31"/>
     <w:bookmarkEnd w:id="32"/>
-    <w:bookmarkStart w:id="33" w:name="X8e49416f199552033a19838cc286b560b59f246"/>
+    <w:bookmarkStart w:id="33" w:name="Xe97db641ae706c87a513a355689c18a6397f0b6"/>
     <w:p>
       <w:pPr>
         <w:pStyle w:val="Heading2"/>
       </w:pPr>
       <w:r>
-        <w:t xml:space="preserve">C. Checklist: 28 chỗ tô vàng cần điền từ code</w:t>
+        <w:t xml:space="preserve">C. Chi tiết thầy yêu cầu nhưng cần code mới bổ sung được</w:t>
+      </w:r>
+    </w:p>
+    <w:p>
+      <w:pPr>
+        <w:pStyle w:val="FirstParagraph"/>
+      </w:pPr>
+      <w:r>
+        <w:t xml:space="preserve">Bài</w:t>
+      </w:r>
+      <w:r>
+        <w:t xml:space="preserve"> </w:t>
+      </w:r>
+      <w:r>
+        <w:rPr>
+          <w:bCs/>
+          <w:b/>
+        </w:rPr>
+        <w:t xml:space="preserve">không bịa</w:t>
+      </w:r>
+      <w:r>
+        <w:t xml:space="preserve"> </w:t>
+      </w:r>
+      <w:r>
+        <w:t xml:space="preserve">các giá trị dưới đây. Câu chữ hiện tại chỉ nêu những gì bản thảo gốc đã có. Khi có code, thêm vào đúng vị trí (mỗi mục thường chỉ cần một mệnh đề hoặc thêm một dòng trong Table 2), rồi xuất lại PDF và kiểm tra vẫn đủ 12 trang.</w:t>
       </w:r>
     </w:p>
     <w:tbl>
@@ -2925,19 +3020,19 @@
               <w:jc w:val="left"/>
             </w:pPr>
             <w:r>
-              <w:t xml:space="preserve">Vị trí</w:t>
-            </w:r>
-          </w:p>
-        </w:tc>
-        <w:tc>
-          <w:tcPr/>
-          <w:p>
-            <w:pPr>
-              <w:pStyle w:val="Compact"/>
-              <w:jc w:val="left"/>
-            </w:pPr>
-            <w:r>
-              <w:t xml:space="preserve">Cần điền</w:t>
+              <w:t xml:space="preserve">Nên thêm vào</w:t>
+            </w:r>
+          </w:p>
+        </w:tc>
+        <w:tc>
+          <w:tcPr/>
+          <w:p>
+            <w:pPr>
+              <w:pStyle w:val="Compact"/>
+              <w:jc w:val="left"/>
+            </w:pPr>
+            <w:r>
+              <w:t xml:space="preserve">Thông tin cần</w:t>
             </w:r>
           </w:p>
         </w:tc>
@@ -2987,7 +3082,257 @@
               <w:jc w:val="left"/>
             </w:pPr>
             <w:r>
-              <w:t xml:space="preserve">Hàm resize và kiểu nội suy (ví dụ PIL</w:t>
+              <w:t xml:space="preserve">Hàm resize và kiểu nội suy</w:t>
+            </w:r>
+          </w:p>
+        </w:tc>
+        <w:tc>
+          <w:tcPr/>
+          <w:p>
+            <w:pPr>
+              <w:pStyle w:val="Compact"/>
+              <w:jc w:val="left"/>
+            </w:pPr>
+            <w:r>
+              <w:t xml:space="preserve">code tiền xử lý</w:t>
+            </w:r>
+          </w:p>
+        </w:tc>
+      </w:tr>
+      <w:tr>
+        <w:tc>
+          <w:tcPr/>
+          <w:p>
+            <w:pPr>
+              <w:pStyle w:val="Compact"/>
+              <w:jc w:val="left"/>
+            </w:pPr>
+            <w:r>
+              <w:t xml:space="preserve">2</w:t>
+            </w:r>
+          </w:p>
+        </w:tc>
+        <w:tc>
+          <w:tcPr/>
+          <w:p>
+            <w:pPr>
+              <w:pStyle w:val="Compact"/>
+              <w:jc w:val="left"/>
+            </w:pPr>
+            <w:r>
+              <w:t xml:space="preserve">3.1</w:t>
+            </w:r>
+          </w:p>
+        </w:tc>
+        <w:tc>
+          <w:tcPr/>
+          <w:p>
+            <w:pPr>
+              <w:pStyle w:val="Compact"/>
+              <w:jc w:val="left"/>
+            </w:pPr>
+            <w:r>
+              <w:t xml:space="preserve">Cách chia 360/120/120 (hoán vị ngẫu nhiên với seed nào; có phân tầng không)</w:t>
+            </w:r>
+          </w:p>
+        </w:tc>
+        <w:tc>
+          <w:tcPr/>
+          <w:p>
+            <w:pPr>
+              <w:pStyle w:val="Compact"/>
+              <w:jc w:val="left"/>
+            </w:pPr>
+            <w:r>
+              <w:t xml:space="preserve">code chia tập / manifest</w:t>
+            </w:r>
+          </w:p>
+        </w:tc>
+      </w:tr>
+      <w:tr>
+        <w:tc>
+          <w:tcPr/>
+          <w:p>
+            <w:pPr>
+              <w:pStyle w:val="Compact"/>
+              <w:jc w:val="left"/>
+            </w:pPr>
+            <w:r>
+              <w:t xml:space="preserve">3</w:t>
+            </w:r>
+          </w:p>
+        </w:tc>
+        <w:tc>
+          <w:tcPr/>
+          <w:p>
+            <w:pPr>
+              <w:pStyle w:val="Compact"/>
+              <w:jc w:val="left"/>
+            </w:pPr>
+            <w:r>
+              <w:t xml:space="preserve">3.1</w:t>
+            </w:r>
+          </w:p>
+        </w:tc>
+        <w:tc>
+          <w:tcPr/>
+          <w:p>
+            <w:pPr>
+              <w:pStyle w:val="Compact"/>
+              <w:jc w:val="left"/>
+            </w:pPr>
+            <w:r>
+              <w:t xml:space="preserve">Thư viện và phiên bản nhúng WOW/S-UNIWARD/HILL; nhúng bằng simulator hay STC</w:t>
+            </w:r>
+          </w:p>
+        </w:tc>
+        <w:tc>
+          <w:tcPr/>
+          <w:p>
+            <w:pPr>
+              <w:pStyle w:val="Compact"/>
+              <w:jc w:val="left"/>
+            </w:pPr>
+            <w:r>
+              <w:t xml:space="preserve">code tạo stego</w:t>
+            </w:r>
+          </w:p>
+        </w:tc>
+      </w:tr>
+      <w:tr>
+        <w:tc>
+          <w:tcPr/>
+          <w:p>
+            <w:pPr>
+              <w:pStyle w:val="Compact"/>
+              <w:jc w:val="left"/>
+            </w:pPr>
+            <w:r>
+              <w:t xml:space="preserve">4</w:t>
+            </w:r>
+          </w:p>
+        </w:tc>
+        <w:tc>
+          <w:tcPr/>
+          <w:p>
+            <w:pPr>
+              <w:pStyle w:val="Compact"/>
+              <w:jc w:val="left"/>
+            </w:pPr>
+            <w:r>
+              <w:t xml:space="preserve">3.2 + Table 2</w:t>
+            </w:r>
+          </w:p>
+        </w:tc>
+        <w:tc>
+          <w:tcPr/>
+          <w:p>
+            <w:pPr>
+              <w:pStyle w:val="Compact"/>
+              <w:jc w:val="left"/>
+            </w:pPr>
+            <w:r>
+              <w:t xml:space="preserve">Các bộ lọc residual và thống kê tạo thành 76 đặc trưng</w:t>
+            </w:r>
+          </w:p>
+        </w:tc>
+        <w:tc>
+          <w:tcPr/>
+          <w:p>
+            <w:pPr>
+              <w:pStyle w:val="Compact"/>
+              <w:jc w:val="left"/>
+            </w:pPr>
+            <w:r>
+              <w:t xml:space="preserve">code trích đặc trưng Residual-LR</w:t>
+            </w:r>
+          </w:p>
+        </w:tc>
+      </w:tr>
+      <w:tr>
+        <w:tc>
+          <w:tcPr/>
+          <w:p>
+            <w:pPr>
+              <w:pStyle w:val="Compact"/>
+              <w:jc w:val="left"/>
+            </w:pPr>
+            <w:r>
+              <w:t xml:space="preserve">5</w:t>
+            </w:r>
+          </w:p>
+        </w:tc>
+        <w:tc>
+          <w:tcPr/>
+          <w:p>
+            <w:pPr>
+              <w:pStyle w:val="Compact"/>
+              <w:jc w:val="left"/>
+            </w:pPr>
+            <w:r>
+              <w:t xml:space="preserve">3.2 + Table 2</w:t>
+            </w:r>
+          </w:p>
+        </w:tc>
+        <w:tc>
+          <w:tcPr/>
+          <w:p>
+            <w:pPr>
+              <w:pStyle w:val="Compact"/>
+              <w:jc w:val="left"/>
+            </w:pPr>
+            <w:r>
+              <w:t xml:space="preserve">Bộ chuẩn hóa đặc trưng và xác nhận chỉ fit trên training pairs</w:t>
+            </w:r>
+          </w:p>
+        </w:tc>
+        <w:tc>
+          <w:tcPr/>
+          <w:p>
+            <w:pPr>
+              <w:pStyle w:val="Compact"/>
+              <w:jc w:val="left"/>
+            </w:pPr>
+            <w:r>
+              <w:t xml:space="preserve">code Residual-LR</w:t>
+            </w:r>
+          </w:p>
+        </w:tc>
+      </w:tr>
+      <w:tr>
+        <w:tc>
+          <w:tcPr/>
+          <w:p>
+            <w:pPr>
+              <w:pStyle w:val="Compact"/>
+              <w:jc w:val="left"/>
+            </w:pPr>
+            <w:r>
+              <w:t xml:space="preserve">6</w:t>
+            </w:r>
+          </w:p>
+        </w:tc>
+        <w:tc>
+          <w:tcPr/>
+          <w:p>
+            <w:pPr>
+              <w:pStyle w:val="Compact"/>
+              <w:jc w:val="left"/>
+            </w:pPr>
+            <w:r>
+              <w:t xml:space="preserve">Table 2</w:t>
+            </w:r>
+          </w:p>
+        </w:tc>
+        <w:tc>
+          <w:tcPr/>
+          <w:p>
+            <w:pPr>
+              <w:pStyle w:val="Compact"/>
+              <w:jc w:val="left"/>
+            </w:pPr>
+            <w:r>
+              <w:t xml:space="preserve">LogisticRegression:</w:t>
             </w:r>
             <w:r>
               <w:t xml:space="preserve"> </w:t>
@@ -2996,10 +3341,10 @@
               <w:rPr>
                 <w:rStyle w:val="VerbatimChar"/>
               </w:rPr>
-              <w:t xml:space="preserve">LANCZOS</w:t>
-            </w:r>
-            <w:r>
-              <w:t xml:space="preserve">, OpenCV</w:t>
+              <w:t xml:space="preserve">solver</w:t>
+            </w:r>
+            <w:r>
+              <w:t xml:space="preserve">,</w:t>
             </w:r>
             <w:r>
               <w:t xml:space="preserve"> </w:t>
@@ -3008,37 +3353,64 @@
               <w:rPr>
                 <w:rStyle w:val="VerbatimChar"/>
               </w:rPr>
-              <w:t xml:space="preserve">INTER_AREA</w:t>
-            </w:r>
-            <w:r>
-              <w:t xml:space="preserve">, Matlab</w:t>
-            </w:r>
-            <w:r>
-              <w:t xml:space="preserve"> </w:t>
+              <w:t xml:space="preserve">penalty</w:t>
+            </w:r>
+            <w:r>
+              <w:t xml:space="preserve">/</w:t>
             </w:r>
             <w:r>
               <w:rPr>
                 <w:rStyle w:val="VerbatimChar"/>
               </w:rPr>
-              <w:t xml:space="preserve">imresize</w:t>
-            </w:r>
-            <w:r>
-              <w:t xml:space="preserve"> </w:t>
-            </w:r>
-            <w:r>
-              <w:t xml:space="preserve">bicubic)</w:t>
-            </w:r>
-          </w:p>
-        </w:tc>
-        <w:tc>
-          <w:tcPr/>
-          <w:p>
-            <w:pPr>
-              <w:pStyle w:val="Compact"/>
-              <w:jc w:val="left"/>
-            </w:pPr>
-            <w:r>
-              <w:t xml:space="preserve">code tiền xử lý</w:t>
+              <w:t xml:space="preserve">C</w:t>
+            </w:r>
+            <w:r>
+              <w:t xml:space="preserve">,</w:t>
+            </w:r>
+            <w:r>
+              <w:t xml:space="preserve"> </w:t>
+            </w:r>
+            <w:r>
+              <w:rPr>
+                <w:rStyle w:val="VerbatimChar"/>
+              </w:rPr>
+              <w:t xml:space="preserve">class_weight</w:t>
+            </w:r>
+            <w:r>
+              <w:t xml:space="preserve">,</w:t>
+            </w:r>
+            <w:r>
+              <w:t xml:space="preserve"> </w:t>
+            </w:r>
+            <w:r>
+              <w:rPr>
+                <w:rStyle w:val="VerbatimChar"/>
+              </w:rPr>
+              <w:t xml:space="preserve">max_iter</w:t>
+            </w:r>
+            <w:r>
+              <w:t xml:space="preserve">,</w:t>
+            </w:r>
+            <w:r>
+              <w:t xml:space="preserve"> </w:t>
+            </w:r>
+            <w:r>
+              <w:rPr>
+                <w:rStyle w:val="VerbatimChar"/>
+              </w:rPr>
+              <w:t xml:space="preserve">random_state</w:t>
+            </w:r>
+          </w:p>
+        </w:tc>
+        <w:tc>
+          <w:tcPr/>
+          <w:p>
+            <w:pPr>
+              <w:pStyle w:val="Compact"/>
+              <w:jc w:val="left"/>
+            </w:pPr>
+            <w:r>
+              <w:t xml:space="preserve">code Residual-LR</w:t>
             </w:r>
           </w:p>
         </w:tc>
@@ -3052,43 +3424,52 @@
               <w:jc w:val="left"/>
             </w:pPr>
             <w:r>
-              <w:t xml:space="preserve">2</w:t>
-            </w:r>
-          </w:p>
-        </w:tc>
-        <w:tc>
-          <w:tcPr/>
-          <w:p>
-            <w:pPr>
-              <w:pStyle w:val="Compact"/>
-              <w:jc w:val="left"/>
-            </w:pPr>
-            <w:r>
-              <w:t xml:space="preserve">3.1</w:t>
-            </w:r>
-          </w:p>
-        </w:tc>
-        <w:tc>
-          <w:tcPr/>
-          <w:p>
-            <w:pPr>
-              <w:pStyle w:val="Compact"/>
-              <w:jc w:val="left"/>
-            </w:pPr>
-            <w:r>
-              <w:t xml:space="preserve">Cách chia 360/120/120 (hoán vị ngẫu nhiên với seed nào; có phân tầng không)</w:t>
-            </w:r>
-          </w:p>
-        </w:tc>
-        <w:tc>
-          <w:tcPr/>
-          <w:p>
-            <w:pPr>
-              <w:pStyle w:val="Compact"/>
-              <w:jc w:val="left"/>
-            </w:pPr>
-            <w:r>
-              <w:t xml:space="preserve">code chia tập / manifest</w:t>
+              <w:t xml:space="preserve">7</w:t>
+            </w:r>
+          </w:p>
+        </w:tc>
+        <w:tc>
+          <w:tcPr/>
+          <w:p>
+            <w:pPr>
+              <w:pStyle w:val="Compact"/>
+              <w:jc w:val="left"/>
+            </w:pPr>
+            <w:r>
+              <w:t xml:space="preserve">Table 2</w:t>
+            </w:r>
+          </w:p>
+        </w:tc>
+        <w:tc>
+          <w:tcPr/>
+          <w:p>
+            <w:pPr>
+              <w:pStyle w:val="Compact"/>
+              <w:jc w:val="left"/>
+            </w:pPr>
+            <w:r>
+              <w:t xml:space="preserve">Điểm số của ensemble: tỉ lệ phiếu (</w:t>
+            </w:r>
+            <w:r>
+              <w:rPr>
+                <w:rStyle w:val="VerbatimChar"/>
+              </w:rPr>
+              <w:t xml:space="preserve">predict_confidence</w:t>
+            </w:r>
+            <w:r>
+              <w:t xml:space="preserve">, chỉ 51 mức khi L = 50) hay tổng phép chiếu FLD; có bootstrap không</w:t>
+            </w:r>
+          </w:p>
+        </w:tc>
+        <w:tc>
+          <w:tcPr/>
+          <w:p>
+            <w:pPr>
+              <w:pStyle w:val="Compact"/>
+              <w:jc w:val="left"/>
+            </w:pPr>
+            <w:r>
+              <w:t xml:space="preserve">code SRM+Ensemble. Ảnh hưởng tới τ_low vì điểm trùng nhau tại ngưỡng</w:t>
             </w:r>
           </w:p>
         </w:tc>
@@ -3102,43 +3483,43 @@
               <w:jc w:val="left"/>
             </w:pPr>
             <w:r>
-              <w:t xml:space="preserve">3</w:t>
-            </w:r>
-          </w:p>
-        </w:tc>
-        <w:tc>
-          <w:tcPr/>
-          <w:p>
-            <w:pPr>
-              <w:pStyle w:val="Compact"/>
-              <w:jc w:val="left"/>
-            </w:pPr>
-            <w:r>
-              <w:t xml:space="preserve">3.1</w:t>
-            </w:r>
-          </w:p>
-        </w:tc>
-        <w:tc>
-          <w:tcPr/>
-          <w:p>
-            <w:pPr>
-              <w:pStyle w:val="Compact"/>
-              <w:jc w:val="left"/>
-            </w:pPr>
-            <w:r>
-              <w:t xml:space="preserve">Thư viện và phiên bản nhúng WOW/S-UNIWARD/HILL; nhúng bằng simulator hay STC</w:t>
-            </w:r>
-          </w:p>
-        </w:tc>
-        <w:tc>
-          <w:tcPr/>
-          <w:p>
-            <w:pPr>
-              <w:pStyle w:val="Compact"/>
-              <w:jc w:val="left"/>
-            </w:pPr>
-            <w:r>
-              <w:t xml:space="preserve">code tạo stego</w:t>
+              <w:t xml:space="preserve">8</w:t>
+            </w:r>
+          </w:p>
+        </w:tc>
+        <w:tc>
+          <w:tcPr/>
+          <w:p>
+            <w:pPr>
+              <w:pStyle w:val="Compact"/>
+              <w:jc w:val="left"/>
+            </w:pPr>
+            <w:r>
+              <w:t xml:space="preserve">3.3</w:t>
+            </w:r>
+          </w:p>
+        </w:tc>
+        <w:tc>
+          <w:tcPr/>
+          <w:p>
+            <w:pPr>
+              <w:pStyle w:val="Compact"/>
+              <w:jc w:val="left"/>
+            </w:pPr>
+            <w:r>
+              <w:t xml:space="preserve">Quy tắc rút biến thể (ngẫu nhiên đều hay cân bằng) và số cặp thực tế theo thuật toán/payload ở P2, P3</w:t>
+            </w:r>
+          </w:p>
+        </w:tc>
+        <w:tc>
+          <w:tcPr/>
+          <w:p>
+            <w:pPr>
+              <w:pStyle w:val="Compact"/>
+              <w:jc w:val="left"/>
+            </w:pPr>
+            <w:r>
+              <w:t xml:space="preserve">code tạo protocol</w:t>
             </w:r>
           </w:p>
         </w:tc>
@@ -3152,43 +3533,43 @@
               <w:jc w:val="left"/>
             </w:pPr>
             <w:r>
-              <w:t xml:space="preserve">4, 5</w:t>
-            </w:r>
-          </w:p>
-        </w:tc>
-        <w:tc>
-          <w:tcPr/>
-          <w:p>
-            <w:pPr>
-              <w:pStyle w:val="Compact"/>
-              <w:jc w:val="left"/>
-            </w:pPr>
-            <w:r>
-              <w:t xml:space="preserve">3.2</w:t>
-            </w:r>
-          </w:p>
-        </w:tc>
-        <w:tc>
-          <w:tcPr/>
-          <w:p>
-            <w:pPr>
-              <w:pStyle w:val="Compact"/>
-              <w:jc w:val="left"/>
-            </w:pPr>
-            <w:r>
-              <w:t xml:space="preserve">K bộ lọc residual và M thống kê tạo thành 76 đặc trưng (nếu 76 không phải K × M thì sửa câu)</w:t>
-            </w:r>
-          </w:p>
-        </w:tc>
-        <w:tc>
-          <w:tcPr/>
-          <w:p>
-            <w:pPr>
-              <w:pStyle w:val="Compact"/>
-              <w:jc w:val="left"/>
-            </w:pPr>
-            <w:r>
-              <w:t xml:space="preserve">code trích đặc trưng Residual-LR</w:t>
+              <w:t xml:space="preserve">9</w:t>
+            </w:r>
+          </w:p>
+        </w:tc>
+        <w:tc>
+          <w:tcPr/>
+          <w:p>
+            <w:pPr>
+              <w:pStyle w:val="Compact"/>
+              <w:jc w:val="left"/>
+            </w:pPr>
+            <w:r>
+              <w:t xml:space="preserve">3.4</w:t>
+            </w:r>
+          </w:p>
+        </w:tc>
+        <w:tc>
+          <w:tcPr/>
+          <w:p>
+            <w:pPr>
+              <w:pStyle w:val="Compact"/>
+              <w:jc w:val="left"/>
+            </w:pPr>
+            <w:r>
+              <w:t xml:space="preserve">Quy tắc chọn τ_low chính xác (bằng điểm nào; xử lý điểm trùng) và τ_BER (cực tiểu BER hay điểm P_FA = P_MD)</w:t>
+            </w:r>
+          </w:p>
+        </w:tc>
+        <w:tc>
+          <w:tcPr/>
+          <w:p>
+            <w:pPr>
+              <w:pStyle w:val="Compact"/>
+              <w:jc w:val="left"/>
+            </w:pPr>
+            <w:r>
+              <w:t xml:space="preserve">code ngưỡng</w:t>
             </w:r>
           </w:p>
         </w:tc>
@@ -3202,43 +3583,52 @@
               <w:jc w:val="left"/>
             </w:pPr>
             <w:r>
-              <w:t xml:space="preserve">6, 7</w:t>
-            </w:r>
-          </w:p>
-        </w:tc>
-        <w:tc>
-          <w:tcPr/>
-          <w:p>
-            <w:pPr>
-              <w:pStyle w:val="Compact"/>
-              <w:jc w:val="left"/>
-            </w:pPr>
-            <w:r>
-              <w:t xml:space="preserve">3.2</w:t>
-            </w:r>
-          </w:p>
-        </w:tc>
-        <w:tc>
-          <w:tcPr/>
-          <w:p>
-            <w:pPr>
-              <w:pStyle w:val="Compact"/>
-              <w:jc w:val="left"/>
-            </w:pPr>
-            <w:r>
-              <w:t xml:space="preserve">Bộ chuẩn hóa (StandardScaler?) và xác nhận chỉ fit trên training pairs của từng lần chạy</w:t>
-            </w:r>
-          </w:p>
-        </w:tc>
-        <w:tc>
-          <w:tcPr/>
-          <w:p>
-            <w:pPr>
-              <w:pStyle w:val="Compact"/>
-              <w:jc w:val="left"/>
-            </w:pPr>
-            <w:r>
-              <w:t xml:space="preserve">code Residual-LR</w:t>
+              <w:t xml:space="preserve">10</w:t>
+            </w:r>
+          </w:p>
+        </w:tc>
+        <w:tc>
+          <w:tcPr/>
+          <w:p>
+            <w:pPr>
+              <w:pStyle w:val="Compact"/>
+              <w:jc w:val="left"/>
+            </w:pPr>
+            <w:r>
+              <w:t xml:space="preserve">3.5</w:t>
+            </w:r>
+          </w:p>
+        </w:tc>
+        <w:tc>
+          <w:tcPr/>
+          <w:p>
+            <w:pPr>
+              <w:pStyle w:val="Compact"/>
+              <w:jc w:val="left"/>
+            </w:pPr>
+            <w:r>
+              <w:t xml:space="preserve">Số lần bootstrap B; cách gộp 3 seed (cùng một lần rút cho cả 3 seed rồi lấy trung bình ΔAUC?); kiểu khoảng (phân vị?)</w:t>
+            </w:r>
+          </w:p>
+        </w:tc>
+        <w:tc>
+          <w:tcPr/>
+          <w:p>
+            <w:pPr>
+              <w:pStyle w:val="Compact"/>
+              <w:jc w:val="left"/>
+            </w:pPr>
+            <w:r>
+              <w:t xml:space="preserve">code bootstrap, hoặc chạy lại</w:t>
+            </w:r>
+            <w:r>
+              <w:t xml:space="preserve"> </w:t>
+            </w:r>
+            <w:r>
+              <w:rPr>
+                <w:rStyle w:val="VerbatimChar"/>
+              </w:rPr>
+              <w:t xml:space="preserve">verify_stats.py</w:t>
             </w:r>
           </w:p>
         </w:tc>
@@ -3252,131 +3642,31 @@
               <w:jc w:val="left"/>
             </w:pPr>
             <w:r>
-              <w:t xml:space="preserve">8</w:t>
-            </w:r>
-          </w:p>
-        </w:tc>
-        <w:tc>
-          <w:tcPr/>
-          <w:p>
-            <w:pPr>
-              <w:pStyle w:val="Compact"/>
-              <w:jc w:val="left"/>
-            </w:pPr>
-            <w:r>
-              <w:t xml:space="preserve">Table 2</w:t>
-            </w:r>
-          </w:p>
-        </w:tc>
-        <w:tc>
-          <w:tcPr/>
-          <w:p>
-            <w:pPr>
-              <w:pStyle w:val="Compact"/>
-              <w:jc w:val="left"/>
-            </w:pPr>
-            <w:r>
-              <w:t xml:space="preserve">Bộ chuẩn hóa của Residual-LR (giống #6)</w:t>
-            </w:r>
-          </w:p>
-        </w:tc>
-        <w:tc>
-          <w:tcPr/>
-          <w:p>
-            <w:pPr>
-              <w:pStyle w:val="Compact"/>
-              <w:jc w:val="left"/>
-            </w:pPr>
-            <w:r>
-              <w:t xml:space="preserve">code Residual-LR</w:t>
-            </w:r>
-          </w:p>
-        </w:tc>
-      </w:tr>
-      <w:tr>
-        <w:tc>
-          <w:tcPr/>
-          <w:p>
-            <w:pPr>
-              <w:pStyle w:val="Compact"/>
-              <w:jc w:val="left"/>
-            </w:pPr>
-            <w:r>
-              <w:t xml:space="preserve">9</w:t>
-            </w:r>
-          </w:p>
-        </w:tc>
-        <w:tc>
-          <w:tcPr/>
-          <w:p>
-            <w:pPr>
-              <w:pStyle w:val="Compact"/>
-              <w:jc w:val="left"/>
-            </w:pPr>
-            <w:r>
-              <w:t xml:space="preserve">Table 2</w:t>
-            </w:r>
-          </w:p>
-        </w:tc>
-        <w:tc>
-          <w:tcPr/>
-          <w:p>
-            <w:pPr>
-              <w:pStyle w:val="Compact"/>
-              <w:jc w:val="left"/>
-            </w:pPr>
-            <w:r>
-              <w:t xml:space="preserve">Có chuẩn hóa đặc trưng SRM trước ensemble không</w:t>
-            </w:r>
-          </w:p>
-        </w:tc>
-        <w:tc>
-          <w:tcPr/>
-          <w:p>
-            <w:pPr>
-              <w:pStyle w:val="Compact"/>
-              <w:jc w:val="left"/>
-            </w:pPr>
-            <w:r>
-              <w:t xml:space="preserve">code SRM+Ensemble</w:t>
-            </w:r>
-          </w:p>
-        </w:tc>
-      </w:tr>
-      <w:tr>
-        <w:tc>
-          <w:tcPr/>
-          <w:p>
-            <w:pPr>
-              <w:pStyle w:val="Compact"/>
-              <w:jc w:val="left"/>
-            </w:pPr>
-            <w:r>
-              <w:t xml:space="preserve">10, 11</w:t>
-            </w:r>
-          </w:p>
-        </w:tc>
-        <w:tc>
-          <w:tcPr/>
-          <w:p>
-            <w:pPr>
-              <w:pStyle w:val="Compact"/>
-              <w:jc w:val="left"/>
-            </w:pPr>
-            <w:r>
-              <w:t xml:space="preserve">Table 2</w:t>
-            </w:r>
-          </w:p>
-        </w:tc>
-        <w:tc>
-          <w:tcPr/>
-          <w:p>
-            <w:pPr>
-              <w:pStyle w:val="Compact"/>
-              <w:jc w:val="left"/>
-            </w:pPr>
-            <w:r>
-              <w:t xml:space="preserve">Phiên bản scikit-learn, sealwatch</w:t>
+              <w:t xml:space="preserve">11</w:t>
+            </w:r>
+          </w:p>
+        </w:tc>
+        <w:tc>
+          <w:tcPr/>
+          <w:p>
+            <w:pPr>
+              <w:pStyle w:val="Compact"/>
+              <w:jc w:val="left"/>
+            </w:pPr>
+            <w:r>
+              <w:t xml:space="preserve">3.5 + Ref. 21</w:t>
+            </w:r>
+          </w:p>
+        </w:tc>
+        <w:tc>
+          <w:tcPr/>
+          <w:p>
+            <w:pPr>
+              <w:pStyle w:val="Compact"/>
+              <w:jc w:val="left"/>
+            </w:pPr>
+            <w:r>
+              <w:t xml:space="preserve">Phiên bản Python, NumPy, scikit-learn, sealwatch; CPU/RAM/OS</w:t>
             </w:r>
           </w:p>
         </w:tc>
@@ -3393,6 +3683,9 @@
               </w:rPr>
               <w:t xml:space="preserve">pip freeze</w:t>
             </w:r>
+            <w:r>
+              <w:t xml:space="preserve">, máy chạy</w:t>
+            </w:r>
           </w:p>
         </w:tc>
       </w:tr>
@@ -3405,387 +3698,43 @@
               <w:jc w:val="left"/>
             </w:pPr>
             <w:r>
-              <w:t xml:space="preserve">12–16</w:t>
-            </w:r>
-          </w:p>
-        </w:tc>
-        <w:tc>
-          <w:tcPr/>
-          <w:p>
-            <w:pPr>
-              <w:pStyle w:val="Compact"/>
-              <w:jc w:val="left"/>
-            </w:pPr>
-            <w:r>
-              <w:t xml:space="preserve">Table 2</w:t>
-            </w:r>
-          </w:p>
-        </w:tc>
-        <w:tc>
-          <w:tcPr/>
-          <w:p>
-            <w:pPr>
-              <w:pStyle w:val="Compact"/>
-              <w:jc w:val="left"/>
-            </w:pPr>
-            <w:r>
-              <w:t xml:space="preserve">LogisticRegression:</w:t>
-            </w:r>
-            <w:r>
-              <w:t xml:space="preserve"> </w:t>
-            </w:r>
-            <w:r>
-              <w:rPr>
-                <w:rStyle w:val="VerbatimChar"/>
-              </w:rPr>
-              <w:t xml:space="preserve">solver</w:t>
-            </w:r>
-            <w:r>
-              <w:t xml:space="preserve">,</w:t>
-            </w:r>
-            <w:r>
-              <w:t xml:space="preserve"> </w:t>
-            </w:r>
-            <w:r>
-              <w:rPr>
-                <w:rStyle w:val="VerbatimChar"/>
-              </w:rPr>
-              <w:t xml:space="preserve">penalty</w:t>
-            </w:r>
-            <w:r>
-              <w:t xml:space="preserve">/</w:t>
-            </w:r>
-            <w:r>
-              <w:rPr>
-                <w:rStyle w:val="VerbatimChar"/>
-              </w:rPr>
-              <w:t xml:space="preserve">C</w:t>
-            </w:r>
-            <w:r>
-              <w:t xml:space="preserve">,</w:t>
-            </w:r>
-            <w:r>
-              <w:t xml:space="preserve"> </w:t>
-            </w:r>
-            <w:r>
-              <w:rPr>
-                <w:rStyle w:val="VerbatimChar"/>
-              </w:rPr>
-              <w:t xml:space="preserve">class_weight</w:t>
-            </w:r>
-            <w:r>
-              <w:t xml:space="preserve">,</w:t>
-            </w:r>
-            <w:r>
-              <w:t xml:space="preserve"> </w:t>
-            </w:r>
-            <w:r>
-              <w:rPr>
-                <w:rStyle w:val="VerbatimChar"/>
-              </w:rPr>
-              <w:t xml:space="preserve">max_iter</w:t>
-            </w:r>
-            <w:r>
-              <w:t xml:space="preserve">,</w:t>
-            </w:r>
-            <w:r>
-              <w:t xml:space="preserve"> </w:t>
-            </w:r>
-            <w:r>
-              <w:rPr>
-                <w:rStyle w:val="VerbatimChar"/>
-              </w:rPr>
-              <w:t xml:space="preserve">random_state</w:t>
-            </w:r>
-          </w:p>
-        </w:tc>
-        <w:tc>
-          <w:tcPr/>
-          <w:p>
-            <w:pPr>
-              <w:pStyle w:val="Compact"/>
-              <w:jc w:val="left"/>
-            </w:pPr>
-            <w:r>
-              <w:t xml:space="preserve">code Residual-LR</w:t>
-            </w:r>
-          </w:p>
-        </w:tc>
-      </w:tr>
-      <w:tr>
-        <w:tc>
-          <w:tcPr/>
-          <w:p>
-            <w:pPr>
-              <w:pStyle w:val="Compact"/>
-              <w:jc w:val="left"/>
-            </w:pPr>
-            <w:r>
-              <w:t xml:space="preserve">17</w:t>
-            </w:r>
-          </w:p>
-        </w:tc>
-        <w:tc>
-          <w:tcPr/>
-          <w:p>
-            <w:pPr>
-              <w:pStyle w:val="Compact"/>
-              <w:jc w:val="left"/>
-            </w:pPr>
-            <w:r>
-              <w:t xml:space="preserve">Table 2</w:t>
-            </w:r>
-          </w:p>
-        </w:tc>
-        <w:tc>
-          <w:tcPr/>
-          <w:p>
-            <w:pPr>
-              <w:pStyle w:val="Compact"/>
-              <w:jc w:val="left"/>
-            </w:pPr>
-            <w:r>
-              <w:t xml:space="preserve">Điểm số dùng cho ROC/ngưỡng: tỉ lệ phiếu (</w:t>
-            </w:r>
-            <w:r>
-              <w:rPr>
-                <w:rStyle w:val="VerbatimChar"/>
-              </w:rPr>
-              <w:t xml:space="preserve">predict_confidence</w:t>
-            </w:r>
-            <w:r>
-              <w:t xml:space="preserve">, chỉ có 51 mức khi L = 50) hay tổng phép chiếu FLD</w:t>
-            </w:r>
-          </w:p>
-        </w:tc>
-        <w:tc>
-          <w:tcPr/>
-          <w:p>
-            <w:pPr>
-              <w:pStyle w:val="Compact"/>
-              <w:jc w:val="left"/>
-            </w:pPr>
-            <w:r>
-              <w:t xml:space="preserve">code SRM+Ensemble.</w:t>
-            </w:r>
-            <w:r>
-              <w:t xml:space="preserve"> </w:t>
-            </w:r>
-            <w:r>
-              <w:rPr>
-                <w:bCs/>
-                <w:b/>
-              </w:rPr>
-              <w:t xml:space="preserve">Ảnh hưởng tới τ_low</w:t>
-            </w:r>
-            <w:r>
-              <w:t xml:space="preserve"> </w:t>
-            </w:r>
-            <w:r>
-              <w:t xml:space="preserve">vì điểm trùng nhau tại ngưỡng</w:t>
-            </w:r>
-          </w:p>
-        </w:tc>
-      </w:tr>
-      <w:tr>
-        <w:tc>
-          <w:tcPr/>
-          <w:p>
-            <w:pPr>
-              <w:pStyle w:val="Compact"/>
-              <w:jc w:val="left"/>
-            </w:pPr>
-            <w:r>
-              <w:t xml:space="preserve">18</w:t>
-            </w:r>
-          </w:p>
-        </w:tc>
-        <w:tc>
-          <w:tcPr/>
-          <w:p>
-            <w:pPr>
-              <w:pStyle w:val="Compact"/>
-              <w:jc w:val="left"/>
-            </w:pPr>
-            <w:r>
-              <w:t xml:space="preserve">3.3</w:t>
-            </w:r>
-          </w:p>
-        </w:tc>
-        <w:tc>
-          <w:tcPr/>
-          <w:p>
-            <w:pPr>
-              <w:pStyle w:val="Compact"/>
-              <w:jc w:val="left"/>
-            </w:pPr>
-            <w:r>
-              <w:t xml:space="preserve">Quy tắc rút biến thể cho mỗi training cover: ngẫu nhiên đều hay cân bằng cố định</w:t>
-            </w:r>
-          </w:p>
-        </w:tc>
-        <w:tc>
-          <w:tcPr/>
-          <w:p>
-            <w:pPr>
-              <w:pStyle w:val="Compact"/>
-              <w:jc w:val="left"/>
-            </w:pPr>
-            <w:r>
-              <w:t xml:space="preserve">code tạo protocol</w:t>
-            </w:r>
-          </w:p>
-        </w:tc>
-      </w:tr>
-      <w:tr>
-        <w:tc>
-          <w:tcPr/>
-          <w:p>
-            <w:pPr>
-              <w:pStyle w:val="Compact"/>
-              <w:jc w:val="left"/>
-            </w:pPr>
-            <w:r>
-              <w:t xml:space="preserve">19</w:t>
-            </w:r>
-          </w:p>
-        </w:tc>
-        <w:tc>
-          <w:tcPr/>
-          <w:p>
-            <w:pPr>
-              <w:pStyle w:val="Compact"/>
-              <w:jc w:val="left"/>
-            </w:pPr>
-            <w:r>
-              <w:t xml:space="preserve">3.3</w:t>
-            </w:r>
-          </w:p>
-        </w:tc>
-        <w:tc>
-          <w:tcPr/>
-          <w:p>
-            <w:pPr>
-              <w:pStyle w:val="Compact"/>
-              <w:jc w:val="left"/>
-            </w:pPr>
-            <w:r>
-              <w:t xml:space="preserve">Validation stego lấy từ cùng pool với training không</w:t>
-            </w:r>
-          </w:p>
-        </w:tc>
-        <w:tc>
-          <w:tcPr/>
-          <w:p>
-            <w:pPr>
-              <w:pStyle w:val="Compact"/>
-              <w:jc w:val="left"/>
-            </w:pPr>
-            <w:r>
-              <w:t xml:space="preserve">code tạo protocol</w:t>
-            </w:r>
-          </w:p>
-        </w:tc>
-      </w:tr>
-      <w:tr>
-        <w:tc>
-          <w:tcPr/>
-          <w:p>
-            <w:pPr>
-              <w:pStyle w:val="Compact"/>
-              <w:jc w:val="left"/>
-            </w:pPr>
-            <w:r>
-              <w:t xml:space="preserve">20</w:t>
-            </w:r>
-          </w:p>
-        </w:tc>
-        <w:tc>
-          <w:tcPr/>
-          <w:p>
-            <w:pPr>
-              <w:pStyle w:val="Compact"/>
-              <w:jc w:val="left"/>
-            </w:pPr>
-            <w:r>
-              <w:t xml:space="preserve">3.5</w:t>
-            </w:r>
-          </w:p>
-        </w:tc>
-        <w:tc>
-          <w:tcPr/>
-          <w:p>
-            <w:pPr>
-              <w:pStyle w:val="Compact"/>
-              <w:jc w:val="left"/>
-            </w:pPr>
-            <w:r>
-              <w:t xml:space="preserve">Số lần bootstrap B</w:t>
-            </w:r>
-          </w:p>
-        </w:tc>
-        <w:tc>
-          <w:tcPr/>
-          <w:p>
-            <w:pPr>
-              <w:pStyle w:val="Compact"/>
-              <w:jc w:val="left"/>
-            </w:pPr>
-            <w:r>
-              <w:t xml:space="preserve">code bootstrap</w:t>
-            </w:r>
-          </w:p>
-        </w:tc>
-      </w:tr>
-      <w:tr>
-        <w:tc>
-          <w:tcPr/>
-          <w:p>
-            <w:pPr>
-              <w:pStyle w:val="Compact"/>
-              <w:jc w:val="left"/>
-            </w:pPr>
-            <w:r>
-              <w:t xml:space="preserve">21</w:t>
-            </w:r>
-          </w:p>
-        </w:tc>
-        <w:tc>
-          <w:tcPr/>
-          <w:p>
-            <w:pPr>
-              <w:pStyle w:val="Compact"/>
-              <w:jc w:val="left"/>
-            </w:pPr>
-            <w:r>
-              <w:t xml:space="preserve">3.5</w:t>
-            </w:r>
-          </w:p>
-        </w:tc>
-        <w:tc>
-          <w:tcPr/>
-          <w:p>
-            <w:pPr>
-              <w:pStyle w:val="Compact"/>
-              <w:jc w:val="left"/>
-            </w:pPr>
-            <w:r>
-              <w:t xml:space="preserve">Xác nhận cách gộp 3 seed và CI phân vị như mô tả</w:t>
-            </w:r>
-          </w:p>
-        </w:tc>
-        <w:tc>
-          <w:tcPr/>
-          <w:p>
-            <w:pPr>
-              <w:pStyle w:val="Compact"/>
-              <w:jc w:val="left"/>
-            </w:pPr>
-            <w:r>
-              <w:t xml:space="preserve">code bootstrap, hoặc chạy lại</w:t>
-            </w:r>
-            <w:r>
-              <w:t xml:space="preserve"> </w:t>
+              <w:t xml:space="preserve">12</w:t>
+            </w:r>
+          </w:p>
+        </w:tc>
+        <w:tc>
+          <w:tcPr/>
+          <w:p>
+            <w:pPr>
+              <w:pStyle w:val="Compact"/>
+              <w:jc w:val="left"/>
+            </w:pPr>
+            <w:r>
+              <w:t xml:space="preserve">4.5 / S3</w:t>
+            </w:r>
+          </w:p>
+        </w:tc>
+        <w:tc>
+          <w:tcPr/>
+          <w:p>
+            <w:pPr>
+              <w:pStyle w:val="Compact"/>
+              <w:jc w:val="left"/>
+            </w:pPr>
+            <w:r>
+              <w:t xml:space="preserve">Số false positive theo từng seed</w:t>
+            </w:r>
+          </w:p>
+        </w:tc>
+        <w:tc>
+          <w:tcPr/>
+          <w:p>
+            <w:pPr>
+              <w:pStyle w:val="Compact"/>
+              <w:jc w:val="left"/>
+            </w:pPr>
+            <w:r>
+              <w:t xml:space="preserve">file điểm số (</w:t>
             </w:r>
             <w:r>
               <w:rPr>
@@ -3793,238 +3742,11 @@
               </w:rPr>
               <w:t xml:space="preserve">verify_stats.py</w:t>
             </w:r>
-          </w:p>
-        </w:tc>
-      </w:tr>
-      <w:tr>
-        <w:tc>
-          <w:tcPr/>
-          <w:p>
-            <w:pPr>
-              <w:pStyle w:val="Compact"/>
-              <w:jc w:val="left"/>
-            </w:pPr>
-            <w:r>
-              <w:t xml:space="preserve">22–25</w:t>
-            </w:r>
-          </w:p>
-        </w:tc>
-        <w:tc>
-          <w:tcPr/>
-          <w:p>
-            <w:pPr>
-              <w:pStyle w:val="Compact"/>
-              <w:jc w:val="left"/>
-            </w:pPr>
-            <w:r>
-              <w:t xml:space="preserve">3.5</w:t>
-            </w:r>
-          </w:p>
-        </w:tc>
-        <w:tc>
-          <w:tcPr/>
-          <w:p>
-            <w:pPr>
-              <w:pStyle w:val="Compact"/>
-              <w:jc w:val="left"/>
-            </w:pPr>
-            <w:r>
-              <w:t xml:space="preserve">Phiên bản Python, NumPy, scikit-learn, sealwatch</w:t>
-            </w:r>
-          </w:p>
-        </w:tc>
-        <w:tc>
-          <w:tcPr/>
-          <w:p>
-            <w:pPr>
-              <w:pStyle w:val="Compact"/>
-              <w:jc w:val="left"/>
-            </w:pPr>
-            <w:r>
-              <w:rPr>
-                <w:rStyle w:val="VerbatimChar"/>
-              </w:rPr>
-              <w:t xml:space="preserve">python --version</w:t>
-            </w:r>
-            <w:r>
-              <w:t xml:space="preserve">,</w:t>
-            </w:r>
-            <w:r>
-              <w:t xml:space="preserve"> </w:t>
-            </w:r>
-            <w:r>
-              <w:rPr>
-                <w:rStyle w:val="VerbatimChar"/>
-              </w:rPr>
-              <w:t xml:space="preserve">pip freeze</w:t>
-            </w:r>
-          </w:p>
-        </w:tc>
-      </w:tr>
-      <w:tr>
-        <w:tc>
-          <w:tcPr/>
-          <w:p>
-            <w:pPr>
-              <w:pStyle w:val="Compact"/>
-              <w:jc w:val="left"/>
-            </w:pPr>
-            <w:r>
-              <w:t xml:space="preserve">26</w:t>
-            </w:r>
-          </w:p>
-        </w:tc>
-        <w:tc>
-          <w:tcPr/>
-          <w:p>
-            <w:pPr>
-              <w:pStyle w:val="Compact"/>
-              <w:jc w:val="left"/>
-            </w:pPr>
-            <w:r>
-              <w:t xml:space="preserve">3.5</w:t>
-            </w:r>
-          </w:p>
-        </w:tc>
-        <w:tc>
-          <w:tcPr/>
-          <w:p>
-            <w:pPr>
-              <w:pStyle w:val="Compact"/>
-              <w:jc w:val="left"/>
-            </w:pPr>
-            <w:r>
-              <w:t xml:space="preserve">Thư viện nhúng và phiên bản (giống #3)</w:t>
-            </w:r>
-          </w:p>
-        </w:tc>
-        <w:tc>
-          <w:tcPr/>
-          <w:p>
-            <w:pPr>
-              <w:pStyle w:val="Compact"/>
-              <w:jc w:val="left"/>
-            </w:pPr>
-            <w:r>
-              <w:rPr>
-                <w:rStyle w:val="VerbatimChar"/>
-              </w:rPr>
-              <w:t xml:space="preserve">pip freeze</w:t>
-            </w:r>
-          </w:p>
-        </w:tc>
-      </w:tr>
-      <w:tr>
-        <w:tc>
-          <w:tcPr/>
-          <w:p>
-            <w:pPr>
-              <w:pStyle w:val="Compact"/>
-              <w:jc w:val="left"/>
-            </w:pPr>
-            <w:r>
-              <w:t xml:space="preserve">27</w:t>
-            </w:r>
-          </w:p>
-        </w:tc>
-        <w:tc>
-          <w:tcPr/>
-          <w:p>
-            <w:pPr>
-              <w:pStyle w:val="Compact"/>
-              <w:jc w:val="left"/>
-            </w:pPr>
-            <w:r>
-              <w:t xml:space="preserve">3.5</w:t>
-            </w:r>
-          </w:p>
-        </w:tc>
-        <w:tc>
-          <w:tcPr/>
-          <w:p>
-            <w:pPr>
-              <w:pStyle w:val="Compact"/>
-              <w:jc w:val="left"/>
-            </w:pPr>
-            <w:r>
-              <w:t xml:space="preserve">CPU, RAM, hệ điều hành</w:t>
-            </w:r>
-          </w:p>
-        </w:tc>
-        <w:tc>
-          <w:tcPr/>
-          <w:p>
-            <w:pPr>
-              <w:pStyle w:val="Compact"/>
-              <w:jc w:val="left"/>
-            </w:pPr>
-            <w:r>
-              <w:t xml:space="preserve">máy chạy thí nghiệm</w:t>
-            </w:r>
-          </w:p>
-        </w:tc>
-      </w:tr>
-      <w:tr>
-        <w:tc>
-          <w:tcPr/>
-          <w:p>
-            <w:pPr>
-              <w:pStyle w:val="Compact"/>
-              <w:jc w:val="left"/>
-            </w:pPr>
-            <w:r>
-              <w:t xml:space="preserve">28</w:t>
-            </w:r>
-          </w:p>
-        </w:tc>
-        <w:tc>
-          <w:tcPr/>
-          <w:p>
-            <w:pPr>
-              <w:pStyle w:val="Compact"/>
-              <w:jc w:val="left"/>
-            </w:pPr>
-            <w:r>
-              <w:t xml:space="preserve">3.5</w:t>
-            </w:r>
-          </w:p>
-        </w:tc>
-        <w:tc>
-          <w:tcPr/>
-          <w:p>
-            <w:pPr>
-              <w:pStyle w:val="Compact"/>
-              <w:jc w:val="left"/>
-            </w:pPr>
-            <w:r>
-              <w:t xml:space="preserve">Link repository chứa code, manifest, scores (hoặc ghi</w:t>
-            </w:r>
-            <w:r>
-              <w:t xml:space="preserve"> </w:t>
-            </w:r>
-            <w:r>
-              <w:t xml:space="preserve">“</w:t>
-            </w:r>
-            <w:r>
-              <w:t xml:space="preserve">available from the authors on request</w:t>
-            </w:r>
-            <w:r>
-              <w:t xml:space="preserve">”</w:t>
-            </w:r>
-            <w:r>
-              <w:t xml:space="preserve">)</w:t>
-            </w:r>
-          </w:p>
-        </w:tc>
-        <w:tc>
-          <w:tcPr/>
-          <w:p>
-            <w:pPr>
-              <w:pStyle w:val="Compact"/>
-              <w:jc w:val="left"/>
-            </w:pPr>
-            <w:r>
-              <w:t xml:space="preserve">nhóm</w:t>
+            <w:r>
+              <w:t xml:space="preserve"> </w:t>
+            </w:r>
+            <w:r>
+              <w:t xml:space="preserve">in ra)</w:t>
             </w:r>
           </w:p>
         </w:tc>
@@ -4035,25 +3757,17 @@
         <w:pStyle w:val="BodyText"/>
       </w:pPr>
       <w:r>
-        <w:t xml:space="preserve">(Một số thông tin xuất hiện hai lần, ở cả chữ lẫn Table 2, nên phải điền giống nhau.)</w:t>
-      </w:r>
-    </w:p>
-    <w:p>
-      <w:pPr>
-        <w:pStyle w:val="BodyText"/>
-      </w:pPr>
-      <w:r>
         <w:rPr>
           <w:bCs/>
           <w:b/>
         </w:rPr>
-        <w:t xml:space="preserve">Các khẳng định không tô vàng nhưng vẫn nên xác nhận:</w:t>
-      </w:r>
-      <w:r>
-        <w:t xml:space="preserve"> </w:t>
-      </w:r>
-      <w:r>
-        <w:t xml:space="preserve">- SRM+Ensemble dùng</w:t>
+        <w:t xml:space="preserve">Nên chạy lại trên dữ liệu gốc:</w:t>
+      </w:r>
+      <w:r>
+        <w:t xml:space="preserve"> </w:t>
+      </w:r>
+      <w:r>
+        <w:t xml:space="preserve">-</w:t>
       </w:r>
       <w:r>
         <w:t xml:space="preserve"> </w:t>
@@ -4062,19 +3776,16 @@
         <w:rPr>
           <w:rStyle w:val="VerbatimChar"/>
         </w:rPr>
-        <w:t xml:space="preserve">FldEnsembleTrainer</w:t>
-      </w:r>
-      <w:r>
-        <w:t xml:space="preserve"> </w:t>
-      </w:r>
-      <w:r>
-        <w:t xml:space="preserve">của sealwatch (thư viện này luôn bootstrap theo cặp cover–stego), với L = 50 và d_sub = 500 cố định.</w:t>
-      </w:r>
-      <w:r>
-        <w:t xml:space="preserve"> </w:t>
-      </w:r>
-      <w:r>
-        <w:t xml:space="preserve">- Chạy</w:t>
+        <w:t xml:space="preserve">scripts/verify_stats.py</w:t>
+      </w:r>
+      <w:r>
+        <w:t xml:space="preserve">: rà lại mọi AUC và CI của RQ1–RQ3 (thầy yêu cầu ở Mục 5).</w:t>
+      </w:r>
+      <w:r>
+        <w:t xml:space="preserve"> </w:t>
+      </w:r>
+      <w:r>
+        <w:t xml:space="preserve">-</w:t>
       </w:r>
       <w:r>
         <w:t xml:space="preserve"> </w:t>
@@ -4083,13 +3794,10 @@
         <w:rPr>
           <w:rStyle w:val="VerbatimChar"/>
         </w:rPr>
-        <w:t xml:space="preserve">audit_manifest.py</w:t>
-      </w:r>
-      <w:r>
-        <w:t xml:space="preserve"> </w:t>
-      </w:r>
-      <w:r>
-        <w:t xml:space="preserve">trên manifest thật phải ra</w:t>
+        <w:t xml:space="preserve">scripts/audit_manifest.py</w:t>
+      </w:r>
+      <w:r>
+        <w:t xml:space="preserve">: kết quả phải là PASS, và SHA-256 khớp</w:t>
       </w:r>
       <w:r>
         <w:t xml:space="preserve"> </w:t>
@@ -4098,13 +3806,16 @@
         <w:rPr>
           <w:rStyle w:val="VerbatimChar"/>
         </w:rPr>
-        <w:t xml:space="preserve">PASS</w:t>
-      </w:r>
-      <w:r>
-        <w:t xml:space="preserve"> </w:t>
-      </w:r>
-      <w:r>
-        <w:t xml:space="preserve">và SHA-256 khớp</w:t>
+        <w:t xml:space="preserve">13c01ca9…2799e8c</w:t>
+      </w:r>
+      <w:r>
+        <w:t xml:space="preserve">.</w:t>
+      </w:r>
+      <w:r>
+        <w:t xml:space="preserve"> </w:t>
+      </w:r>
+      <w:r>
+        <w:t xml:space="preserve">- Script hiện chọn τ_BER theo cực tiểu BER; nếu code gốc dùng điểm cân bằng P_FA = P_MD thì sửa hàm</w:t>
       </w:r>
       <w:r>
         <w:t xml:space="preserve"> </w:t>
@@ -4113,64 +3824,879 @@
         <w:rPr>
           <w:rStyle w:val="VerbatimChar"/>
         </w:rPr>
-        <w:t xml:space="preserve">13c01ca9…2799e8c</w:t>
+        <w:t xml:space="preserve">tau_ber</w:t>
       </w:r>
       <w:r>
         <w:t xml:space="preserve">.</w:t>
       </w:r>
-      <w:r>
-        <w:t xml:space="preserve"> </w:t>
-      </w:r>
-      <w:r>
-        <w:t xml:space="preserve">- Số FP theo từng seed (</w:t>
+    </w:p>
+    <w:bookmarkEnd w:id="33"/>
+    <w:bookmarkStart w:id="34" w:name="X5d16513da6d985f554ccd36f1b7bab53b6ac550"/>
+    <w:p>
+      <w:pPr>
+        <w:pStyle w:val="Heading2"/>
+      </w:pPr>
+      <w:r>
+        <w:t xml:space="preserve">E. Đợt kiểm tra độc lập trước khi xuất bản .docm</w:t>
+      </w:r>
+    </w:p>
+    <w:p>
+      <w:pPr>
+        <w:pStyle w:val="FirstParagraph"/>
+      </w:pPr>
+      <w:r>
+        <w:t xml:space="preserve">Sáu agent soát bản thảo theo sáu góc nhìn:</w:t>
+      </w:r>
+      <w:r>
+        <w:t xml:space="preserve"> </w:t>
+      </w:r>
+      <w:r>
+        <w:t xml:space="preserve">1. căn cứ của Abstract, Mục 1–2 và Table 1;</w:t>
+      </w:r>
+      <w:r>
+        <w:t xml:space="preserve"> </w:t>
+      </w:r>
+      <w:r>
+        <w:t xml:space="preserve">2. căn cứ của Mục 3;</w:t>
+      </w:r>
+      <w:r>
+        <w:t xml:space="preserve"> </w:t>
+      </w:r>
+      <w:r>
+        <w:t xml:space="preserve">3. cách diễn giải ở Mục 4–5;</w:t>
+      </w:r>
+      <w:r>
+        <w:t xml:space="preserve"> </w:t>
+      </w:r>
+      <w:r>
+        <w:t xml:space="preserve">4. tính nhất quán số liệu;</w:t>
+      </w:r>
+      <w:r>
+        <w:t xml:space="preserve"> </w:t>
+      </w:r>
+      <w:r>
+        <w:t xml:space="preserve">5. đáp ứng góp ý của thầy;</w:t>
+      </w:r>
+      <w:r>
+        <w:t xml:space="preserve"> </w:t>
+      </w:r>
+      <w:r>
+        <w:t xml:space="preserve">6. ngôn ngữ và định dạng.</w:t>
+      </w:r>
+    </w:p>
+    <w:p>
+      <w:pPr>
+        <w:pStyle w:val="BodyText"/>
+      </w:pPr>
+      <w:r>
+        <w:t xml:space="preserve">Có 70 lỗi được nêu. Từng lỗi được đối chiếu với bản thảo gốc,</w:t>
+      </w:r>
+      <w:r>
+        <w:t xml:space="preserve"> </w:t>
       </w:r>
       <w:r>
         <w:rPr>
           <w:rStyle w:val="VerbatimChar"/>
         </w:rPr>
-        <w:t xml:space="preserve">verify_stats.py</w:t>
-      </w:r>
-      <w:r>
-        <w:t xml:space="preserve"> </w:t>
-      </w:r>
-      <w:r>
-        <w:t xml:space="preserve">in ra) khớp tổng 15/15/19 và 18/11/8.</w:t>
-      </w:r>
-    </w:p>
-    <w:p>
-      <w:pPr>
-        <w:pStyle w:val="BodyText"/>
+        <w:t xml:space="preserve">results_data.py</w:t>
+      </w:r>
+      <w:r>
+        <w:t xml:space="preserve"> </w:t>
+      </w:r>
+      <w:r>
+        <w:t xml:space="preserve">và toàn văn các bài tham khảo đã tải về. Những sửa đổi chính:</w:t>
+      </w:r>
+    </w:p>
+    <w:p>
+      <w:pPr>
+        <w:numPr>
+          <w:ilvl w:val="0"/>
+          <w:numId w:val="1011"/>
+        </w:numPr>
+        <w:pStyle w:val="Compact"/>
       </w:pPr>
       <w:r>
         <w:rPr>
           <w:bCs/>
           <w:b/>
         </w:rPr>
-        <w:t xml:space="preserve">Cách hoàn thiện trong Word:</w:t>
-      </w:r>
-      <w:r>
-        <w:t xml:space="preserve"> </w:t>
-      </w:r>
-      <w:r>
-        <w:t xml:space="preserve">1. Điền các chỗ tô vàng rồi bỏ tô vàng.</w:t>
-      </w:r>
-      <w:r>
-        <w:t xml:space="preserve"> </w:t>
-      </w:r>
-      <w:r>
-        <w:t xml:space="preserve">2. Ctrl+A rồi F9 để cập nhật trường số bảng/hình.</w:t>
-      </w:r>
-      <w:r>
-        <w:t xml:space="preserve"> </w:t>
-      </w:r>
-      <w:r>
-        <w:t xml:space="preserve">3. Xuất PDF và kiểm tra đúng 12 trang.</w:t>
-      </w:r>
-      <w:r>
-        <w:t xml:space="preserve"> </w:t>
-      </w:r>
-      <w:r>
-        <w:t xml:space="preserve">4. Nếu dùng EndNote, import</w:t>
+        <w:t xml:space="preserve">Eq. (1):</w:t>
+      </w:r>
+      <w:r>
+        <w:t xml:space="preserve"> </w:t>
+      </w:r>
+      <w:r>
+        <w:t xml:space="preserve">bỏ quy tắc</w:t>
+      </w:r>
+      <w:r>
+        <w:t xml:space="preserve"> </w:t>
+      </w:r>
+      <w:r>
+        <w:t xml:space="preserve">“</w:t>
+      </w:r>
+      <w:r>
+        <w:t xml:space="preserve">min</w:t>
+      </w:r>
+      <w:r>
+        <w:t xml:space="preserve">”</w:t>
+      </w:r>
+      <w:r>
+        <w:t xml:space="preserve"> </w:t>
+      </w:r>
+      <w:r>
+        <w:t xml:space="preserve">vì bản gốc không nêu, và cực tiểu thực ra không tồn tại. Nay chỉ còn ràng buộc FPR_V(τ_low) ≤ 0,01.</w:t>
+      </w:r>
+    </w:p>
+    <w:p>
+      <w:pPr>
+        <w:numPr>
+          <w:ilvl w:val="0"/>
+          <w:numId w:val="1011"/>
+        </w:numPr>
+        <w:pStyle w:val="Compact"/>
+      </w:pPr>
+      <w:r>
+        <w:rPr>
+          <w:bCs/>
+          <w:b/>
+        </w:rPr>
+        <w:t xml:space="preserve">τ_BER:</w:t>
+      </w:r>
+      <w:r>
+        <w:t xml:space="preserve"> </w:t>
+      </w:r>
+      <w:r>
+        <w:t xml:space="preserve">ghi</w:t>
+      </w:r>
+      <w:r>
+        <w:t xml:space="preserve"> </w:t>
+      </w:r>
+      <w:r>
+        <w:t xml:space="preserve">“</w:t>
+      </w:r>
+      <w:r>
+        <w:t xml:space="preserve">balanced-error point</w:t>
+      </w:r>
+      <w:r>
+        <w:t xml:space="preserve">”</w:t>
+      </w:r>
+      <w:r>
+        <w:t xml:space="preserve"> </w:t>
+      </w:r>
+      <w:r>
+        <w:t xml:space="preserve">đúng như bản gốc.</w:t>
+      </w:r>
+    </w:p>
+    <w:p>
+      <w:pPr>
+        <w:numPr>
+          <w:ilvl w:val="0"/>
+          <w:numId w:val="1011"/>
+        </w:numPr>
+        <w:pStyle w:val="Compact"/>
+      </w:pPr>
+      <w:r>
+        <w:rPr>
+          <w:bCs/>
+          <w:b/>
+        </w:rPr>
+        <w:t xml:space="preserve">Các câu khẳng định quá mức đã sửa:</w:t>
+      </w:r>
+    </w:p>
+    <w:p>
+      <w:pPr>
+        <w:numPr>
+          <w:ilvl w:val="1"/>
+          <w:numId w:val="1012"/>
+        </w:numPr>
+        <w:pStyle w:val="Compact"/>
+      </w:pPr>
+      <w:r>
+        <w:t xml:space="preserve">“</w:t>
+      </w:r>
+      <w:r>
+        <w:t xml:space="preserve">not a pure effect</w:t>
+      </w:r>
+      <w:r>
+        <w:t xml:space="preserve">”</w:t>
+      </w:r>
+      <w:r>
+        <w:t xml:space="preserve"> </w:t>
+      </w:r>
+      <w:r>
+        <w:t xml:space="preserve">→</w:t>
+      </w:r>
+      <w:r>
+        <w:t xml:space="preserve"> </w:t>
+      </w:r>
+      <w:r>
+        <w:t xml:space="preserve">“</w:t>
+      </w:r>
+      <w:r>
+        <w:t xml:space="preserve">need not be</w:t>
+      </w:r>
+      <w:r>
+        <w:t xml:space="preserve">”</w:t>
+      </w:r>
+      <w:r>
+        <w:t xml:space="preserve">;</w:t>
+      </w:r>
+    </w:p>
+    <w:p>
+      <w:pPr>
+        <w:numPr>
+          <w:ilvl w:val="1"/>
+          <w:numId w:val="1012"/>
+        </w:numPr>
+        <w:pStyle w:val="Compact"/>
+      </w:pPr>
+      <w:r>
+        <w:t xml:space="preserve">“</w:t>
+      </w:r>
+      <w:r>
+        <w:t xml:space="preserve">did not help</w:t>
+      </w:r>
+      <w:r>
+        <w:t xml:space="preserve">”</w:t>
+      </w:r>
+      <w:r>
+        <w:t xml:space="preserve"> </w:t>
+      </w:r>
+      <w:r>
+        <w:t xml:space="preserve">→</w:t>
+      </w:r>
+      <w:r>
+        <w:t xml:space="preserve"> </w:t>
+      </w:r>
+      <w:r>
+        <w:t xml:space="preserve">“</w:t>
+      </w:r>
+      <w:r>
+        <w:t xml:space="preserve">no reliable improvement</w:t>
+      </w:r>
+      <w:r>
+        <w:t xml:space="preserve">”</w:t>
+      </w:r>
+      <w:r>
+        <w:t xml:space="preserve">;</w:t>
+      </w:r>
+    </w:p>
+    <w:p>
+      <w:pPr>
+        <w:numPr>
+          <w:ilvl w:val="1"/>
+          <w:numId w:val="1012"/>
+        </w:numPr>
+        <w:pStyle w:val="Compact"/>
+      </w:pPr>
+      <w:r>
+        <w:t xml:space="preserve">“</w:t>
+      </w:r>
+      <w:r>
+        <w:t xml:space="preserve">both far weaker</w:t>
+      </w:r>
+      <w:r>
+        <w:t xml:space="preserve">”</w:t>
+      </w:r>
+      <w:r>
+        <w:t xml:space="preserve"> </w:t>
+      </w:r>
+      <w:r>
+        <w:t xml:space="preserve">→ chỉ SRM+Ensemble giảm mạnh, Residual-LR giảm nhẹ;</w:t>
+      </w:r>
+    </w:p>
+    <w:p>
+      <w:pPr>
+        <w:numPr>
+          <w:ilvl w:val="1"/>
+          <w:numId w:val="1012"/>
+        </w:numPr>
+        <w:pStyle w:val="Compact"/>
+      </w:pPr>
+      <w:r>
+        <w:t xml:space="preserve">“</w:t>
+      </w:r>
+      <w:r>
+        <w:t xml:space="preserve">no matched signal</w:t>
+      </w:r>
+      <w:r>
+        <w:t xml:space="preserve">”</w:t>
+      </w:r>
+      <w:r>
+        <w:t xml:space="preserve"> </w:t>
+      </w:r>
+      <w:r>
+        <w:t xml:space="preserve">→</w:t>
+      </w:r>
+      <w:r>
+        <w:t xml:space="preserve"> </w:t>
+      </w:r>
+      <w:r>
+        <w:t xml:space="preserve">“</w:t>
+      </w:r>
+      <w:r>
+        <w:t xml:space="preserve">too weak to serve as a reference</w:t>
+      </w:r>
+      <w:r>
+        <w:t xml:space="preserve">”</w:t>
+      </w:r>
+      <w:r>
+        <w:t xml:space="preserve">;</w:t>
+      </w:r>
+    </w:p>
+    <w:p>
+      <w:pPr>
+        <w:numPr>
+          <w:ilvl w:val="1"/>
+          <w:numId w:val="1012"/>
+        </w:numPr>
+        <w:pStyle w:val="Compact"/>
+      </w:pPr>
+      <w:r>
+        <w:t xml:space="preserve">“</w:t>
+      </w:r>
+      <w:r>
+        <w:t xml:space="preserve">mirrors [13]</w:t>
+      </w:r>
+      <w:r>
+        <w:t xml:space="preserve">”</w:t>
+      </w:r>
+      <w:r>
+        <w:t xml:space="preserve"> </w:t>
+      </w:r>
+      <w:r>
+        <w:t xml:space="preserve">→</w:t>
+      </w:r>
+      <w:r>
+        <w:t xml:space="preserve"> </w:t>
+      </w:r>
+      <w:r>
+        <w:t xml:space="preserve">“</w:t>
+      </w:r>
+      <w:r>
+        <w:t xml:space="preserve">agrees in direction with [13]</w:t>
+      </w:r>
+      <w:r>
+        <w:t xml:space="preserve">”</w:t>
+      </w:r>
+      <w:r>
+        <w:t xml:space="preserve">, kèm khác biệt về thiết kế;</w:t>
+      </w:r>
+    </w:p>
+    <w:p>
+      <w:pPr>
+        <w:numPr>
+          <w:ilvl w:val="1"/>
+          <w:numId w:val="1012"/>
+        </w:numPr>
+        <w:pStyle w:val="Compact"/>
+      </w:pPr>
+      <w:r>
+        <w:t xml:space="preserve">câu về FPR test trích đúng nội dung của [18].</w:t>
+      </w:r>
+    </w:p>
+    <w:p>
+      <w:pPr>
+        <w:numPr>
+          <w:ilvl w:val="0"/>
+          <w:numId w:val="1011"/>
+        </w:numPr>
+        <w:pStyle w:val="Compact"/>
+      </w:pPr>
+      <w:r>
+        <w:rPr>
+          <w:bCs/>
+          <w:b/>
+        </w:rPr>
+        <w:t xml:space="preserve">Câu suy diễn không có căn cứ đã sửa:</w:t>
+      </w:r>
+    </w:p>
+    <w:p>
+      <w:pPr>
+        <w:numPr>
+          <w:ilvl w:val="1"/>
+          <w:numId w:val="1013"/>
+        </w:numPr>
+        <w:pStyle w:val="Compact"/>
+      </w:pPr>
+      <w:r>
+        <w:t xml:space="preserve">“</w:t>
+      </w:r>
+      <w:r>
+        <w:t xml:space="preserve">audit kiểm tra đúng 6 biến thể</w:t>
+      </w:r>
+      <w:r>
+        <w:t xml:space="preserve">”</w:t>
+      </w:r>
+      <w:r>
+        <w:t xml:space="preserve"> </w:t>
+      </w:r>
+      <w:r>
+        <w:t xml:space="preserve">→ chỉ ghi điều bản gốc nêu;</w:t>
+      </w:r>
+    </w:p>
+    <w:p>
+      <w:pPr>
+        <w:numPr>
+          <w:ilvl w:val="1"/>
+          <w:numId w:val="1013"/>
+        </w:numPr>
+        <w:pStyle w:val="Compact"/>
+      </w:pPr>
+      <w:r>
+        <w:t xml:space="preserve">“</w:t>
+      </w:r>
+      <w:r>
+        <w:t xml:space="preserve">HILL never enters validation</w:t>
+      </w:r>
+      <w:r>
+        <w:t xml:space="preserve">”</w:t>
+      </w:r>
+      <w:r>
+        <w:t xml:space="preserve"> </w:t>
+      </w:r>
+      <w:r>
+        <w:t xml:space="preserve">→</w:t>
+      </w:r>
+      <w:r>
+        <w:t xml:space="preserve"> </w:t>
+      </w:r>
+      <w:r>
+        <w:t xml:space="preserve">“</w:t>
+      </w:r>
+      <w:r>
+        <w:t xml:space="preserve">never used for model fitting or threshold selection</w:t>
+      </w:r>
+      <w:r>
+        <w:t xml:space="preserve">”</w:t>
+      </w:r>
+      <w:r>
+        <w:t xml:space="preserve">;</w:t>
+      </w:r>
+    </w:p>
+    <w:p>
+      <w:pPr>
+        <w:numPr>
+          <w:ilvl w:val="1"/>
+          <w:numId w:val="1013"/>
+        </w:numPr>
+        <w:pStyle w:val="Compact"/>
+      </w:pPr>
+      <w:r>
+        <w:t xml:space="preserve">“</w:t>
+      </w:r>
+      <w:r>
+        <w:t xml:space="preserve">real-valued score</w:t>
+      </w:r>
+      <w:r>
+        <w:t xml:space="preserve">”</w:t>
+      </w:r>
+      <w:r>
+        <w:t xml:space="preserve"> </w:t>
+      </w:r>
+      <w:r>
+        <w:t xml:space="preserve">→</w:t>
+      </w:r>
+      <w:r>
+        <w:t xml:space="preserve"> </w:t>
+      </w:r>
+      <w:r>
+        <w:t xml:space="preserve">“</w:t>
+      </w:r>
+      <w:r>
+        <w:t xml:space="preserve">score</w:t>
+      </w:r>
+      <w:r>
+        <w:t xml:space="preserve">”</w:t>
+      </w:r>
+      <w:r>
+        <w:t xml:space="preserve">;</w:t>
+      </w:r>
+    </w:p>
+    <w:p>
+      <w:pPr>
+        <w:numPr>
+          <w:ilvl w:val="1"/>
+          <w:numId w:val="1013"/>
+        </w:numPr>
+        <w:pStyle w:val="Compact"/>
+      </w:pPr>
+      <w:r>
+        <w:t xml:space="preserve">“</w:t>
+      </w:r>
+      <w:r>
+        <w:t xml:space="preserve">Residual-LR is deterministic</w:t>
+      </w:r>
+      <w:r>
+        <w:t xml:space="preserve">”</w:t>
+      </w:r>
+      <w:r>
+        <w:t xml:space="preserve"> </w:t>
+      </w:r>
+      <w:r>
+        <w:t xml:space="preserve">→</w:t>
+      </w:r>
+      <w:r>
+        <w:t xml:space="preserve"> </w:t>
+      </w:r>
+      <w:r>
+        <w:t xml:space="preserve">“</w:t>
+      </w:r>
+      <w:r>
+        <w:t xml:space="preserve">nếu 3 lần chạy giống nhau, như SD = 0 gợi ý</w:t>
+      </w:r>
+      <w:r>
+        <w:t xml:space="preserve">”</w:t>
+      </w:r>
+      <w:r>
+        <w:t xml:space="preserve">.</w:t>
+      </w:r>
+    </w:p>
+    <w:p>
+      <w:pPr>
+        <w:numPr>
+          <w:ilvl w:val="0"/>
+          <w:numId w:val="1011"/>
+        </w:numPr>
+        <w:pStyle w:val="Compact"/>
+      </w:pPr>
+      <w:r>
+        <w:rPr>
+          <w:bCs/>
+          <w:b/>
+        </w:rPr>
+        <w:t xml:space="preserve">Abstract:</w:t>
+      </w:r>
+      <w:r>
+        <w:t xml:space="preserve"> </w:t>
+      </w:r>
+      <w:r>
+        <w:t xml:space="preserve">ghi rõ số liệu nào thuộc detector nào.</w:t>
+      </w:r>
+    </w:p>
+    <w:p>
+      <w:pPr>
+        <w:numPr>
+          <w:ilvl w:val="0"/>
+          <w:numId w:val="1011"/>
+        </w:numPr>
+        <w:pStyle w:val="Compact"/>
+      </w:pPr>
+      <w:r>
+        <w:rPr>
+          <w:bCs/>
+          <w:b/>
+        </w:rPr>
+        <w:t xml:space="preserve">Table 1:</w:t>
+      </w:r>
+    </w:p>
+    <w:p>
+      <w:pPr>
+        <w:numPr>
+          <w:ilvl w:val="1"/>
+          <w:numId w:val="1014"/>
+        </w:numPr>
+        <w:pStyle w:val="Compact"/>
+      </w:pPr>
+      <w:r>
+        <w:t xml:space="preserve">ô Low-FPR của [13] →</w:t>
+      </w:r>
+      <w:r>
+        <w:t xml:space="preserve"> </w:t>
+      </w:r>
+      <w:r>
+        <w:t xml:space="preserve">“</w:t>
+      </w:r>
+      <w:r>
+        <w:t xml:space="preserve">Not reported</w:t>
+      </w:r>
+      <w:r>
+        <w:t xml:space="preserve">”</w:t>
+      </w:r>
+      <w:r>
+        <w:t xml:space="preserve"> </w:t>
+      </w:r>
+      <w:r>
+        <w:t xml:space="preserve">([13] báo cáo P_MD ở mức false alarm ngang nhau, không phải một FPR cố định; đã xác minh từ toàn văn);</w:t>
+      </w:r>
+    </w:p>
+    <w:p>
+      <w:pPr>
+        <w:numPr>
+          <w:ilvl w:val="1"/>
+          <w:numId w:val="1014"/>
+        </w:numPr>
+        <w:pStyle w:val="Compact"/>
+      </w:pPr>
+      <w:r>
+        <w:t xml:space="preserve">ALASKA: cột Shift ghi thêm</w:t>
+      </w:r>
+      <w:r>
+        <w:t xml:space="preserve"> </w:t>
+      </w:r>
+      <w:r>
+        <w:t xml:space="preserve">“</w:t>
+      </w:r>
+      <w:r>
+        <w:t xml:space="preserve">algorithm</w:t>
+      </w:r>
+      <w:r>
+        <w:t xml:space="preserve">”</w:t>
+      </w:r>
+      <w:r>
+        <w:t xml:space="preserve">;</w:t>
+      </w:r>
+    </w:p>
+    <w:p>
+      <w:pPr>
+        <w:numPr>
+          <w:ilvl w:val="1"/>
+          <w:numId w:val="1014"/>
+        </w:numPr>
+        <w:pStyle w:val="Compact"/>
+      </w:pPr>
+      <w:r>
+        <w:t xml:space="preserve">CSM: ô detector chỉ ghi điều có trong tóm tắt;</w:t>
+      </w:r>
+    </w:p>
+    <w:p>
+      <w:pPr>
+        <w:numPr>
+          <w:ilvl w:val="1"/>
+          <w:numId w:val="1014"/>
+        </w:numPr>
+        <w:pStyle w:val="Compact"/>
+      </w:pPr>
+      <w:r>
+        <w:t xml:space="preserve">chú thích bảng định nghĩa P_E, P_MD, CSM.</w:t>
+      </w:r>
+    </w:p>
+    <w:p>
+      <w:pPr>
+        <w:numPr>
+          <w:ilvl w:val="1"/>
+          <w:numId w:val="1014"/>
+        </w:numPr>
+        <w:pStyle w:val="Compact"/>
+      </w:pPr>
+      <w:r>
+        <w:t xml:space="preserve">Ô</w:t>
+      </w:r>
+      <w:r>
+        <w:t xml:space="preserve"> </w:t>
+      </w:r>
+      <w:r>
+        <w:t xml:space="preserve">“</w:t>
+      </w:r>
+      <w:r>
+        <w:t xml:space="preserve">Pretrained SRNet</w:t>
+      </w:r>
+      <w:r>
+        <w:t xml:space="preserve">”</w:t>
+      </w:r>
+      <w:r>
+        <w:t xml:space="preserve"> </w:t>
+      </w:r>
+      <w:r>
+        <w:t xml:space="preserve">và</w:t>
+      </w:r>
+      <w:r>
+        <w:t xml:space="preserve"> </w:t>
+      </w:r>
+      <w:r>
+        <w:t xml:space="preserve">“</w:t>
+      </w:r>
+      <w:r>
+        <w:t xml:space="preserve">FPR 10⁻³–10⁻¹</w:t>
+      </w:r>
+      <w:r>
+        <w:t xml:space="preserve">”</w:t>
+      </w:r>
+      <w:r>
+        <w:t xml:space="preserve"> </w:t>
+      </w:r>
+      <w:r>
+        <w:t xml:space="preserve">của MODE được</w:t>
+      </w:r>
+      <w:r>
+        <w:t xml:space="preserve"> </w:t>
+      </w:r>
+      <w:r>
+        <w:rPr>
+          <w:bCs/>
+          <w:b/>
+        </w:rPr>
+        <w:t xml:space="preserve">giữ nguyên</w:t>
+      </w:r>
+      <w:r>
+        <w:t xml:space="preserve"> </w:t>
+      </w:r>
+      <w:r>
+        <w:t xml:space="preserve">vì toàn văn xác nhận.</w:t>
+      </w:r>
+    </w:p>
+    <w:p>
+      <w:pPr>
+        <w:numPr>
+          <w:ilvl w:val="0"/>
+          <w:numId w:val="1011"/>
+        </w:numPr>
+        <w:pStyle w:val="Compact"/>
+      </w:pPr>
+      <w:r>
+        <w:rPr>
+          <w:bCs/>
+          <w:b/>
+        </w:rPr>
+        <w:t xml:space="preserve">Định dạng:</w:t>
+      </w:r>
+    </w:p>
+    <w:p>
+      <w:pPr>
+        <w:numPr>
+          <w:ilvl w:val="1"/>
+          <w:numId w:val="1015"/>
+        </w:numPr>
+        <w:pStyle w:val="Compact"/>
+      </w:pPr>
+      <w:r>
+        <w:t xml:space="preserve">tiêu đề cột</w:t>
+      </w:r>
+      <w:r>
+        <w:t xml:space="preserve"> </w:t>
+      </w:r>
+      <w:r>
+        <w:t xml:space="preserve">“</w:t>
+      </w:r>
+      <w:r>
+        <w:t xml:space="preserve">Protocol</w:t>
+      </w:r>
+      <w:r>
+        <w:t xml:space="preserve">”</w:t>
+      </w:r>
+      <w:r>
+        <w:t xml:space="preserve"> </w:t>
+      </w:r>
+      <w:r>
+        <w:t xml:space="preserve">bị cắt chữ →</w:t>
+      </w:r>
+      <w:r>
+        <w:t xml:space="preserve"> </w:t>
+      </w:r>
+      <w:r>
+        <w:t xml:space="preserve">“</w:t>
+      </w:r>
+      <w:r>
+        <w:t xml:space="preserve">P</w:t>
+      </w:r>
+      <w:r>
+        <w:t xml:space="preserve">”</w:t>
+      </w:r>
+      <w:r>
+        <w:t xml:space="preserve">;</w:t>
+      </w:r>
+    </w:p>
+    <w:p>
+      <w:pPr>
+        <w:numPr>
+          <w:ilvl w:val="1"/>
+          <w:numId w:val="1015"/>
+        </w:numPr>
+        <w:pStyle w:val="Compact"/>
+      </w:pPr>
+      <w:r>
+        <w:t xml:space="preserve">Hình 1 dùng τ_low, d_sub dạng chỉ số dưới, ghi</w:t>
+      </w:r>
+      <w:r>
+        <w:t xml:space="preserve"> </w:t>
+      </w:r>
+      <w:r>
+        <w:t xml:space="preserve">“</w:t>
+      </w:r>
+      <w:r>
+        <w:t xml:space="preserve">18 comparisons</w:t>
+      </w:r>
+      <w:r>
+        <w:t xml:space="preserve">”</w:t>
+      </w:r>
+      <w:r>
+        <w:t xml:space="preserve">;</w:t>
+      </w:r>
+    </w:p>
+    <w:p>
+      <w:pPr>
+        <w:numPr>
+          <w:ilvl w:val="1"/>
+          <w:numId w:val="1015"/>
+        </w:numPr>
+        <w:pStyle w:val="Compact"/>
+      </w:pPr>
+      <w:r>
+        <w:t xml:space="preserve">viết đầy đủ FLD, CNN, bpp ở lần dùng đầu;</w:t>
+      </w:r>
+    </w:p>
+    <w:p>
+      <w:pPr>
+        <w:numPr>
+          <w:ilvl w:val="1"/>
+          <w:numId w:val="1015"/>
+        </w:numPr>
+        <w:pStyle w:val="Compact"/>
+      </w:pPr>
+      <w:r>
+        <w:t xml:space="preserve">Supplementary bỏ các câu dạng ghi chú nội bộ.</w:t>
+      </w:r>
+    </w:p>
+    <w:p>
+      <w:pPr>
+        <w:numPr>
+          <w:ilvl w:val="0"/>
+          <w:numId w:val="1011"/>
+        </w:numPr>
+        <w:pStyle w:val="Compact"/>
+      </w:pPr>
+      <w:r>
+        <w:rPr>
+          <w:bCs/>
+          <w:b/>
+        </w:rPr>
+        <w:t xml:space="preserve">Số liệu:</w:t>
+      </w:r>
+      <w:r>
+        <w:t xml:space="preserve"> </w:t>
+      </w:r>
+      <w:r>
+        <w:t xml:space="preserve">recall trung bình được làm tròn bằng số thập phân chính xác (SRM P2 0,069 → 0,070). Các chú thích ghi rõ ΔAUC tính từ AUC chưa làm tròn.</w:t>
+      </w:r>
+    </w:p>
+    <w:p>
+      <w:pPr>
+        <w:pStyle w:val="FirstParagraph"/>
+      </w:pPr>
+      <w:r>
+        <w:t xml:space="preserve">Đã bác 4 đề xuất: ô MODE (đã đúng), đổi dấu phân cách Keywords (giữ đúng kiểu 581), trục x riêng cho Hình 2 (giữ chung trục để so sánh được hai detector), và xóa dòng SRM/CSM khỏi Table 1.</w:t>
+      </w:r>
+    </w:p>
+    <w:bookmarkEnd w:id="34"/>
+    <w:bookmarkStart w:id="35" w:name="X6c50599336e66b87f6532ded33a73f2e6c4a3ad"/>
+    <w:p>
+      <w:pPr>
+        <w:pStyle w:val="Heading2"/>
+      </w:pPr>
+      <w:r>
+        <w:t xml:space="preserve">D. Hoàn thiện trong Word và dựng lại từ mã nguồn</w:t>
+      </w:r>
+    </w:p>
+    <w:p>
+      <w:pPr>
+        <w:numPr>
+          <w:ilvl w:val="0"/>
+          <w:numId w:val="1016"/>
+        </w:numPr>
+        <w:pStyle w:val="Compact"/>
+      </w:pPr>
+      <w:r>
+        <w:t xml:space="preserve">Mở</w:t>
       </w:r>
       <w:r>
         <w:t xml:space="preserve"> </w:t>
@@ -4179,13 +4705,46 @@
         <w:rPr>
           <w:rStyle w:val="VerbatimChar"/>
         </w:rPr>
+        <w:t xml:space="preserve">manuscript/StegaGuard_revised.docm</w:t>
+      </w:r>
+      <w:r>
+        <w:t xml:space="preserve">, nhấn Ctrl+A rồi F9 để cập nhật trường số bảng/hình.</w:t>
+      </w:r>
+    </w:p>
+    <w:p>
+      <w:pPr>
+        <w:numPr>
+          <w:ilvl w:val="0"/>
+          <w:numId w:val="1016"/>
+        </w:numPr>
+        <w:pStyle w:val="Compact"/>
+      </w:pPr>
+      <w:r>
+        <w:t xml:space="preserve">Xuất PDF và kiểm tra đúng 12 trang. Bản xuất bằng LibreOffice: 12 trang, trang cuối đầy khoảng 82%.</w:t>
+      </w:r>
+    </w:p>
+    <w:p>
+      <w:pPr>
+        <w:numPr>
+          <w:ilvl w:val="0"/>
+          <w:numId w:val="1016"/>
+        </w:numPr>
+        <w:pStyle w:val="Compact"/>
+      </w:pPr>
+      <w:r>
+        <w:t xml:space="preserve">Nếu dùng EndNote: import</w:t>
+      </w:r>
+      <w:r>
+        <w:t xml:space="preserve"> </w:t>
+      </w:r>
+      <w:r>
+        <w:rPr>
+          <w:rStyle w:val="VerbatimChar"/>
+        </w:rPr>
         <w:t xml:space="preserve">docs/references.ris</w:t>
       </w:r>
       <w:r>
-        <w:t xml:space="preserve"> </w:t>
-      </w:r>
-      <w:r>
-        <w:t xml:space="preserve">rồi chèn lại trích dẫn bằng EndNote, style</w:t>
+        <w:t xml:space="preserve">, chèn lại trích dẫn bằng EndNote với style</w:t>
       </w:r>
       <w:r>
         <w:t xml:space="preserve"> </w:t>
@@ -4203,16 +4762,6 @@
         <w:t xml:space="preserve">.</w:t>
       </w:r>
     </w:p>
-    <w:bookmarkEnd w:id="33"/>
-    <w:bookmarkStart w:id="34" w:name="d.-dựng-lại-từ-mã-nguồn"/>
-    <w:p>
-      <w:pPr>
-        <w:pStyle w:val="Heading2"/>
-      </w:pPr>
-      <w:r>
-        <w:t xml:space="preserve">D. Dựng lại từ mã nguồn</w:t>
-      </w:r>
-    </w:p>
     <w:p>
       <w:pPr>
         <w:pStyle w:val="SourceCode"/>
@@ -4358,8 +4907,8 @@
         <w:t xml:space="preserve">có ở đầu từng script.</w:t>
       </w:r>
     </w:p>
-    <w:bookmarkEnd w:id="34"/>
     <w:bookmarkEnd w:id="35"/>
+    <w:bookmarkEnd w:id="36"/>
     <w:sectPr/>
   </w:body>
 </w:document>
@@ -4713,6 +5262,51 @@
   </w:num>
   <w:num w:numId="1010">
     <w:abstractNumId w:val="991"/>
+  </w:num>
+  <w:num w:numId="1011">
+    <w:abstractNumId w:val="991"/>
+  </w:num>
+  <w:num w:numId="1012">
+    <w:abstractNumId w:val="991"/>
+  </w:num>
+  <w:num w:numId="1013">
+    <w:abstractNumId w:val="991"/>
+  </w:num>
+  <w:num w:numId="1014">
+    <w:abstractNumId w:val="991"/>
+  </w:num>
+  <w:num w:numId="1015">
+    <w:abstractNumId w:val="991"/>
+  </w:num>
+  <w:num w:numId="1016">
+    <w:abstractNumId w:val="99411"/>
+    <w:lvlOverride w:ilvl="0">
+      <w:startOverride w:val="1"/>
+    </w:lvlOverride>
+    <w:lvlOverride w:ilvl="1">
+      <w:startOverride w:val="1"/>
+    </w:lvlOverride>
+    <w:lvlOverride w:ilvl="2">
+      <w:startOverride w:val="1"/>
+    </w:lvlOverride>
+    <w:lvlOverride w:ilvl="3">
+      <w:startOverride w:val="1"/>
+    </w:lvlOverride>
+    <w:lvlOverride w:ilvl="4">
+      <w:startOverride w:val="1"/>
+    </w:lvlOverride>
+    <w:lvlOverride w:ilvl="5">
+      <w:startOverride w:val="1"/>
+    </w:lvlOverride>
+    <w:lvlOverride w:ilvl="6">
+      <w:startOverride w:val="1"/>
+    </w:lvlOverride>
+    <w:lvlOverride w:ilvl="7">
+      <w:startOverride w:val="1"/>
+    </w:lvlOverride>
+    <w:lvlOverride w:ilvl="8">
+      <w:startOverride w:val="1"/>
+    </w:lvlOverride>
   </w:num>
 </w:numbering>
 </file>

</xml_diff>